<commit_message>
docs(ieee): format Word document in exact official IEEE 2-column layout
</commit_message>
<xml_diff>
--- a/IEEE_Conference_Paper.docx
+++ b/IEEE_Conference_Paper.docx
@@ -2,6 +2,20 @@
 <file path=word/document.xml><?xml version="1.0" encoding="utf-8"?>
 <w:document xmlns:wpc="http://schemas.microsoft.com/office/word/2010/wordprocessingCanvas" xmlns:mo="http://schemas.microsoft.com/office/mac/office/2008/main" xmlns:mc="http://schemas.openxmlformats.org/markup-compatibility/2006" xmlns:mv="urn:schemas-microsoft-com:mac:vml" xmlns:o="urn:schemas-microsoft-com:office:office" xmlns:r="http://schemas.openxmlformats.org/officeDocument/2006/relationships" xmlns:m="http://schemas.openxmlformats.org/officeDocument/2006/math" xmlns:v="urn:schemas-microsoft-com:vml" xmlns:wp14="http://schemas.microsoft.com/office/word/2010/wordprocessingDrawing" xmlns:wp="http://schemas.openxmlformats.org/drawingml/2006/wordprocessingDrawing" xmlns:w10="urn:schemas-microsoft-com:office:word" xmlns:w="http://schemas.openxmlformats.org/wordprocessingml/2006/main" xmlns:w14="http://schemas.microsoft.com/office/word/2010/wordml" xmlns:wpg="http://schemas.microsoft.com/office/word/2010/wordprocessingGroup" xmlns:wpi="http://schemas.microsoft.com/office/word/2010/wordprocessingInk" xmlns:wne="http://schemas.microsoft.com/office/word/2006/wordml" xmlns:wps="http://schemas.microsoft.com/office/word/2010/wordprocessingShape" mc:Ignorable="w14 wp14">
   <w:body>
+    <w:p>
+      <w:pPr>
+        <w:spacing w:before="0" w:after="120"/>
+        <w:jc w:val="center"/>
+      </w:pPr>
+      <w:r>
+        <w:rPr>
+          <w:rFonts w:ascii="Times New Roman" w:hAnsi="Times New Roman"/>
+          <w:b/>
+          <w:sz w:val="48"/>
+        </w:rPr>
+        <w:t>Hierarchical Adaptive Fuzzy Control (HAFC) for Geospatial Multi-Zone Precision Irrigation with Hard Mass Conservation and Real-Time Atmospheric Forcing</w:t>
+      </w:r>
+    </w:p>
     <w:p>
       <w:pPr>
         <w:spacing w:before="0" w:after="240"/>
@@ -9,11 +23,10 @@
       </w:pPr>
       <w:r>
         <w:rPr>
-          <w:rFonts w:ascii="Times New Roman" w:hAnsi="Times New Roman"/>
-          <w:b/>
-          <w:sz w:val="40"/>
+          <w:i/>
+          <w:sz w:val="16"/>
         </w:rPr>
-        <w:t>Hierarchical Adaptive Fuzzy Control (HAFC) for Geospatial Multi-Zone Precision Irrigation with Hard Mass Conservation and Real-Time Atmospheric Forcing</w:t>
+        <w:t>*Note: Sub-titles are not captured in IEEE Xplore and should not be used</w:t>
       </w:r>
     </w:p>
     <w:tbl>
@@ -24,35 +37,47 @@
         <w:tblLook w:firstColumn="1" w:firstRow="1" w:lastColumn="0" w:lastRow="0" w:noHBand="0" w:noVBand="1" w:val="04A0"/>
       </w:tblPr>
       <w:tblGrid>
-        <w:gridCol w:w="5112"/>
-        <w:gridCol w:w="5112"/>
+        <w:gridCol w:w="5220"/>
+        <w:gridCol w:w="5220"/>
       </w:tblGrid>
       <w:tr>
         <w:tc>
           <w:tcPr>
-            <w:tcW w:type="dxa" w:w="4752"/>
+            <w:tcW w:type="dxa" w:w="5040"/>
           </w:tcPr>
           <w:p>
             <w:pPr>
+              <w:spacing w:line="252" w:lineRule="auto" w:after="0"/>
               <w:jc w:val="center"/>
             </w:pPr>
             <w:r>
               <w:rPr>
                 <w:b/>
-                <w:sz w:val="22"/>
+                <w:sz w:val="20"/>
               </w:rPr>
-              <w:t>Pranshu Rajan</w:t>
+              <w:t>1st Pranshu Rajan</w:t>
               <w:br/>
             </w:r>
             <w:r>
               <w:rPr>
                 <w:i/>
-                <w:sz w:val="19"/>
+                <w:sz w:val="18"/>
               </w:rPr>
-              <w:t>Dept. of Electronics &amp; Instrumentation Engineering</w:t>
+              <w:t>Dept. of Electronics and Instrumentation Engineering</w:t>
               <w:br/>
+            </w:r>
+            <w:r>
+              <w:rPr>
+                <w:i/>
+                <w:sz w:val="18"/>
+              </w:rPr>
               <w:t>National Institute of Technology / Engineering Division</w:t>
               <w:br/>
+            </w:r>
+            <w:r>
+              <w:rPr>
+                <w:sz w:val="18"/>
+              </w:rPr>
               <w:t>India</w:t>
               <w:br/>
               <w:t>pranshu.rajan@ieee.org</w:t>
@@ -61,29 +86,41 @@
         </w:tc>
         <w:tc>
           <w:tcPr>
-            <w:tcW w:type="dxa" w:w="4752"/>
+            <w:tcW w:type="dxa" w:w="5040"/>
           </w:tcPr>
           <w:p>
             <w:pPr>
+              <w:spacing w:line="252" w:lineRule="auto" w:after="0"/>
               <w:jc w:val="center"/>
             </w:pPr>
             <w:r>
               <w:rPr>
                 <w:b/>
-                <w:sz w:val="22"/>
+                <w:sz w:val="20"/>
               </w:rPr>
-              <w:t>Divyansh Patel</w:t>
+              <w:t>2nd Divyansh Patel</w:t>
               <w:br/>
             </w:r>
             <w:r>
               <w:rPr>
                 <w:i/>
-                <w:sz w:val="19"/>
+                <w:sz w:val="18"/>
               </w:rPr>
-              <w:t>Dept. of Electronics &amp; Instrumentation Engineering</w:t>
+              <w:t>Dept. of Electronics and Instrumentation Engineering</w:t>
               <w:br/>
+            </w:r>
+            <w:r>
+              <w:rPr>
+                <w:i/>
+                <w:sz w:val="18"/>
+              </w:rPr>
               <w:t>National Institute of Technology / Engineering Division</w:t>
               <w:br/>
+            </w:r>
+            <w:r>
+              <w:rPr>
+                <w:sz w:val="18"/>
+              </w:rPr>
               <w:t>India</w:t>
               <w:br/>
               <w:t>divyansh.patel@ieee.org</w:t>
@@ -94,13 +131,22 @@
     </w:tbl>
     <w:p>
       <w:pPr>
-        <w:spacing w:after="200"/>
+        <w:spacing w:before="80" w:after="120"/>
       </w:pPr>
     </w:p>
     <w:p>
       <w:pPr>
-        <w:spacing w:after="160"/>
-        <w:ind w:left="360" w:right="360"/>
+        <w:sectPr>
+          <w:pgSz w:w="12240" w:h="15840"/>
+          <w:pgMar w:top="1080" w:right="900" w:bottom="1440" w:left="900" w:header="720" w:footer="720" w:gutter="0"/>
+          <w:cols w:space="720"/>
+          <w:docGrid w:linePitch="360"/>
+        </w:sectPr>
+      </w:pPr>
+    </w:p>
+    <w:p>
+      <w:pPr>
+        <w:spacing w:before="0" w:after="80" w:line="252" w:lineRule="auto"/>
         <w:jc w:val="both"/>
       </w:pPr>
       <w:r>
@@ -121,8 +167,8 @@
     </w:p>
     <w:p>
       <w:pPr>
-        <w:spacing w:after="320"/>
-        <w:ind w:left="360" w:right="360"/>
+        <w:spacing w:before="0" w:after="160" w:line="252" w:lineRule="auto"/>
+        <w:jc w:val="both"/>
       </w:pPr>
       <w:r>
         <w:rPr>
@@ -142,7 +188,7 @@
     <w:p>
       <w:pPr>
         <w:keepNext/>
-        <w:spacing w:before="280" w:after="120"/>
+        <w:spacing w:before="200" w:after="80"/>
         <w:jc w:val="center"/>
       </w:pPr>
       <w:r>
@@ -156,7 +202,8 @@
     </w:p>
     <w:p>
       <w:pPr>
-        <w:spacing w:before="0" w:after="120" w:line="276" w:lineRule="auto"/>
+        <w:spacing w:before="0" w:after="80" w:line="252" w:lineRule="auto"/>
+        <w:ind w:firstLine="202"/>
         <w:jc w:val="both"/>
       </w:pPr>
       <w:r>
@@ -164,12 +211,13 @@
           <w:rFonts w:ascii="Times New Roman" w:hAnsi="Times New Roman"/>
           <w:sz w:val="20"/>
         </w:rPr>
-        <w:t>Agriculture accounts for more than 70% of global freshwater withdrawals, with significant volumetric inefficiencies stemming from archaic hydraulic control paradigms. In developing and agrarian economies such as India, escalating climate volatility, erratic monsoon onset, and over-drafted aquifers have created an acute need for autonomous, closed-loop precision irrigation.</w:t>
+        <w:t>Agriculture accounts for more than 70% of global freshwater withdrawals, with significant volumetric inefficiencies stemming from archaic hydraulic control paradigms [1]. In developing and agrarian economies such as India, escalating climate volatility, erratic monsoon onset, and over-drafted aquifers have created an acute need for autonomous, closed-loop precision irrigation.</w:t>
       </w:r>
     </w:p>
     <w:p>
       <w:pPr>
-        <w:spacing w:before="0" w:after="120" w:line="276" w:lineRule="auto"/>
+        <w:spacing w:before="0" w:after="80" w:line="252" w:lineRule="auto"/>
+        <w:ind w:firstLine="202"/>
         <w:jc w:val="both"/>
       </w:pPr>
       <w:r>
@@ -178,19 +226,68 @@
           <w:sz w:val="20"/>
         </w:rPr>
         <w:t>Conventional automated irrigation deployments in commercial fields suffer from severe structural limitations:</w:t>
-        <w:br/>
-        <w:t>1) On-Off Limit-Cycle Chattering: Simple moisture threshold switches (θ &lt; θ_threshold) generate high-amplitude limit cycles. They over-irrigate during actuation, inducing anaerobic soil conditions and deep nutrient leaching, followed by prolonged drought undershoots.</w:t>
-        <w:br/>
-        <w:t>2) Classical PID Inadequacy: Proportional-Integral-Derivative (PID) control relies on the linear time-invariant (LTI) assumption. However, soil moisture retention follows highly non-linear, hysteretic Richards equation dynamics coupled with prolonged infiltration transport delays (&gt; 30 min).</w:t>
-        <w:br/>
-        <w:t>3) Atmospheric Decoupling: Most embedded field systems operate purely retrospectively on historical soil moisture readings, remaining oblivious to upcoming evaporative driving forces driven by solar irradiance, vapor pressure deficits, and impending rainfall.</w:t>
-        <w:br/>
-        <w:t>4) Unconstrained Shared-Supply Arbitration: Agricultural basins partition land into multi-crop zones (e.g., high-value cash vegetables alongside drought-tolerant cereals). When reservoir capacity is degraded, independent zonal controllers deplete the shared reservoir simultaneously, resulting in pump cavitation and random crop failure.</w:t>
       </w:r>
     </w:p>
     <w:p>
       <w:pPr>
-        <w:spacing w:before="0" w:after="120" w:line="276" w:lineRule="auto"/>
+        <w:spacing w:before="0" w:after="40" w:line="252" w:lineRule="auto"/>
+        <w:ind w:left="259" w:hanging="173"/>
+        <w:jc w:val="both"/>
+      </w:pPr>
+      <w:r>
+        <w:rPr>
+          <w:rFonts w:ascii="Times New Roman" w:hAnsi="Times New Roman"/>
+          <w:sz w:val="19"/>
+        </w:rPr>
+        <w:t>• On-Off Limit-Cycle Chattering: Simple moisture threshold switches (θ &lt; θ_threshold) generate high-amplitude limit cycles. They over-irrigate during actuation, inducing anaerobic soil conditions and deep nutrient leaching, followed by prolonged drought undershoots [4].</w:t>
+      </w:r>
+    </w:p>
+    <w:p>
+      <w:pPr>
+        <w:spacing w:before="0" w:after="40" w:line="252" w:lineRule="auto"/>
+        <w:ind w:left="259" w:hanging="173"/>
+        <w:jc w:val="both"/>
+      </w:pPr>
+      <w:r>
+        <w:rPr>
+          <w:rFonts w:ascii="Times New Roman" w:hAnsi="Times New Roman"/>
+          <w:sz w:val="19"/>
+        </w:rPr>
+        <w:t>• Classical PID Inadequacy: Proportional-Integral-Derivative (PID) control relies on the linear time-invariant (LTI) assumption. However, soil moisture retention follows highly non-linear, hysteretic Richards equation dynamics coupled with prolonged infiltration transport delays (&gt; 30 min) [5].</w:t>
+      </w:r>
+    </w:p>
+    <w:p>
+      <w:pPr>
+        <w:spacing w:before="0" w:after="40" w:line="252" w:lineRule="auto"/>
+        <w:ind w:left="259" w:hanging="173"/>
+        <w:jc w:val="both"/>
+      </w:pPr>
+      <w:r>
+        <w:rPr>
+          <w:rFonts w:ascii="Times New Roman" w:hAnsi="Times New Roman"/>
+          <w:sz w:val="19"/>
+        </w:rPr>
+        <w:t>• Atmospheric Decoupling: Most embedded field systems operate purely retrospectively on historical soil moisture readings, remaining oblivious to upcoming evaporative driving forces driven by solar irradiance, vapor pressure deficits, and impending rainfall.</w:t>
+      </w:r>
+    </w:p>
+    <w:p>
+      <w:pPr>
+        <w:spacing w:before="0" w:after="40" w:line="252" w:lineRule="auto"/>
+        <w:ind w:left="259" w:hanging="173"/>
+        <w:jc w:val="both"/>
+      </w:pPr>
+      <w:r>
+        <w:rPr>
+          <w:rFonts w:ascii="Times New Roman" w:hAnsi="Times New Roman"/>
+          <w:sz w:val="19"/>
+        </w:rPr>
+        <w:t>• Unconstrained Shared-Supply Arbitration: Agricultural basins partition land into multi-crop zones (e.g., high-value cash vegetables alongside drought-tolerant cereals). When reservoir capacity is degraded, independent zonal controllers deplete the shared reservoir simultaneously, resulting in pump cavitation and random crop failure.</w:t>
+      </w:r>
+    </w:p>
+    <w:p>
+      <w:pPr>
+        <w:spacing w:before="0" w:after="80" w:line="252" w:lineRule="auto"/>
+        <w:ind w:firstLine="202"/>
         <w:jc w:val="both"/>
       </w:pPr>
       <w:r>
@@ -203,7 +300,8 @@
     </w:p>
     <w:p>
       <w:pPr>
-        <w:spacing w:before="0" w:after="120" w:line="276" w:lineRule="auto"/>
+        <w:spacing w:before="0" w:after="80" w:line="252" w:lineRule="auto"/>
+        <w:ind w:firstLine="202"/>
         <w:jc w:val="both"/>
       </w:pPr>
       <w:r>
@@ -212,20 +310,68 @@
           <w:sz w:val="20"/>
         </w:rPr>
         <w:t>The principal scientific and technological contributions of this study are:</w:t>
-        <w:br/>
+      </w:r>
+    </w:p>
+    <w:p>
+      <w:pPr>
+        <w:spacing w:before="0" w:after="40" w:line="252" w:lineRule="auto"/>
+        <w:ind w:left="259" w:hanging="173"/>
+        <w:jc w:val="both"/>
+      </w:pPr>
+      <w:r>
+        <w:rPr>
+          <w:rFonts w:ascii="Times New Roman" w:hAnsi="Times New Roman"/>
+          <w:sz w:val="19"/>
+        </w:rPr>
         <w:t>• Five-Stage Cascaded Fuzzy Engine: Formulation of five interconnected Mamdani FIS modules operating across root-zone soil hydrology, meteorology, crop phenology, supervisory hydraulic safety, and multi-zone arbitration.</w:t>
-        <w:br/>
+      </w:r>
+    </w:p>
+    <w:p>
+      <w:pPr>
+        <w:spacing w:before="0" w:after="40" w:line="252" w:lineRule="auto"/>
+        <w:ind w:left="259" w:hanging="173"/>
+        <w:jc w:val="both"/>
+      </w:pPr>
+      <w:r>
+        <w:rPr>
+          <w:rFonts w:ascii="Times New Roman" w:hAnsi="Times New Roman"/>
+          <w:sz w:val="19"/>
+        </w:rPr>
         <w:t>• FAO-56 Physical Coupling: Direct embedding of Penman-Monteith radiation and vapor deficit equations to proactively modulate irrigation aperture prior to peak diurnal transpiration.</w:t>
-        <w:br/>
+      </w:r>
+    </w:p>
+    <w:p>
+      <w:pPr>
+        <w:spacing w:before="0" w:after="40" w:line="252" w:lineRule="auto"/>
+        <w:ind w:left="259" w:hanging="173"/>
+        <w:jc w:val="both"/>
+      </w:pPr>
+      <w:r>
+        <w:rPr>
+          <w:rFonts w:ascii="Times New Roman" w:hAnsi="Times New Roman"/>
+          <w:sz w:val="19"/>
+        </w:rPr>
         <w:t>• Hard Mass Conservation Invariant: A formal bounded priority-weighted water-filling optimizer proving that allocated water never exceeds available reservoir capacity (∑ Q_i ≤ V_available) with zero artificial water creation (|Residual| &lt; 10⁻⁶ mm).</w:t>
-        <w:br/>
+      </w:r>
+    </w:p>
+    <w:p>
+      <w:pPr>
+        <w:spacing w:before="0" w:after="40" w:line="252" w:lineRule="auto"/>
+        <w:ind w:left="259" w:hanging="173"/>
+        <w:jc w:val="both"/>
+      </w:pPr>
+      <w:r>
+        <w:rPr>
+          <w:rFonts w:ascii="Times New Roman" w:hAnsi="Times New Roman"/>
+          <w:sz w:val="19"/>
+        </w:rPr>
         <w:t>• Cyber-Physical WebGIS Command Center: An industrial-grade platform capable of resolving any Indian coordinate into its ICAR agro-climatic zone, dominant soil taxonomy, and live Open-Meteo telemetry with sub-18.2 ms inference turnaround.</w:t>
       </w:r>
     </w:p>
     <w:p>
       <w:pPr>
         <w:keepNext/>
-        <w:spacing w:before="280" w:after="120"/>
+        <w:spacing w:before="200" w:after="80"/>
         <w:jc w:val="center"/>
       </w:pPr>
       <w:r>
@@ -240,7 +386,7 @@
     <w:p>
       <w:pPr>
         <w:keepNext/>
-        <w:spacing w:before="200" w:after="80"/>
+        <w:spacing w:before="160" w:after="60"/>
         <w:jc w:val="left"/>
       </w:pPr>
       <w:r>
@@ -255,7 +401,8 @@
     </w:p>
     <w:p>
       <w:pPr>
-        <w:spacing w:before="0" w:after="120" w:line="276" w:lineRule="auto"/>
+        <w:spacing w:before="0" w:after="80" w:line="252" w:lineRule="auto"/>
+        <w:ind w:firstLine="202"/>
         <w:jc w:val="both"/>
       </w:pPr>
       <w:r>
@@ -264,17 +411,54 @@
           <w:sz w:val="20"/>
         </w:rPr>
         <w:t>Soil volumetric water content is defined as the volumetric ratio θ = V_w / V_t [m³·m⁻³ or %]. The soil matrix exhibits three fundamental physical thresholds:</w:t>
-        <w:br/>
-        <w:t>1) Permanent Wilting Point (θ_wp): Capillary suction pressure at -1500 kPa, below which plants cannot extract moisture.</w:t>
-        <w:br/>
-        <w:t>2) Field Capacity (θ_fc): Moisture content held against gravitational drainage at -33 kPa.</w:t>
-        <w:br/>
-        <w:t>3) Saturation (θ_sat): Pore spaces fully saturated with water at 0 kPa.</w:t>
       </w:r>
     </w:p>
     <w:p>
       <w:pPr>
-        <w:spacing w:before="0" w:after="120" w:line="276" w:lineRule="auto"/>
+        <w:spacing w:before="0" w:after="40" w:line="252" w:lineRule="auto"/>
+        <w:ind w:left="259" w:hanging="173"/>
+        <w:jc w:val="both"/>
+      </w:pPr>
+      <w:r>
+        <w:rPr>
+          <w:rFonts w:ascii="Times New Roman" w:hAnsi="Times New Roman"/>
+          <w:sz w:val="19"/>
+        </w:rPr>
+        <w:t>• Permanent Wilting Point (θ_wp): Capillary suction pressure at -1500 kPa, below which plants cannot extract moisture.</w:t>
+      </w:r>
+    </w:p>
+    <w:p>
+      <w:pPr>
+        <w:spacing w:before="0" w:after="40" w:line="252" w:lineRule="auto"/>
+        <w:ind w:left="259" w:hanging="173"/>
+        <w:jc w:val="both"/>
+      </w:pPr>
+      <w:r>
+        <w:rPr>
+          <w:rFonts w:ascii="Times New Roman" w:hAnsi="Times New Roman"/>
+          <w:sz w:val="19"/>
+        </w:rPr>
+        <w:t>• Field Capacity (θ_fc): Moisture content held against gravitational drainage at -33 kPa.</w:t>
+      </w:r>
+    </w:p>
+    <w:p>
+      <w:pPr>
+        <w:spacing w:before="0" w:after="40" w:line="252" w:lineRule="auto"/>
+        <w:ind w:left="259" w:hanging="173"/>
+        <w:jc w:val="both"/>
+      </w:pPr>
+      <w:r>
+        <w:rPr>
+          <w:rFonts w:ascii="Times New Roman" w:hAnsi="Times New Roman"/>
+          <w:sz w:val="19"/>
+        </w:rPr>
+        <w:t>• Saturation (θ_sat): Pore spaces fully saturated with water at 0 kPa.</w:t>
+      </w:r>
+    </w:p>
+    <w:p>
+      <w:pPr>
+        <w:spacing w:before="0" w:after="80" w:line="252" w:lineRule="auto"/>
+        <w:ind w:firstLine="202"/>
         <w:jc w:val="both"/>
       </w:pPr>
       <w:r>
@@ -287,41 +471,54 @@
     </w:p>
     <w:p>
       <w:pPr>
-        <w:spacing w:before="80" w:after="80"/>
-        <w:jc w:val="center"/>
+        <w:spacing w:before="60" w:after="60"/>
+        <w:jc w:val="both"/>
       </w:pPr>
       <w:r>
         <w:rPr>
-          <w:rFonts w:ascii="Times New Roman" w:hAnsi="Times New Roman"/>
           <w:i/>
-          <w:sz w:val="20"/>
+          <w:sz w:val="19"/>
         </w:rPr>
-        <w:tab/>
-        <w:t>AWC = θ_fc - θ_wp</w:t>
-        <w:tab/>
+        <w:t xml:space="preserve">    AWC = θ_fc - θ_wp</w:t>
+      </w:r>
+      <w:r>
+        <w:t xml:space="preserve">   </w:t>
+      </w:r>
+      <w:r>
+        <w:rPr>
+          <w:b/>
+          <w:sz w:val="19"/>
+        </w:rPr>
         <w:t>(1)</w:t>
       </w:r>
     </w:p>
     <w:p>
       <w:pPr>
-        <w:spacing w:before="80" w:after="80"/>
-        <w:jc w:val="center"/>
+        <w:spacing w:before="60" w:after="60"/>
+        <w:jc w:val="both"/>
       </w:pPr>
       <w:r>
         <w:rPr>
-          <w:rFonts w:ascii="Times New Roman" w:hAnsi="Times New Roman"/>
           <w:i/>
-          <w:sz w:val="20"/>
+          <w:sz w:val="19"/>
         </w:rPr>
-        <w:tab/>
-        <w:t>RSM(t) = [θ(t) - θ_wp] / [θ_fc - θ_wp] ∈ [0, 1]</w:t>
-        <w:tab/>
+        <w:t xml:space="preserve">    RSM(t) = [θ(t) - θ_wp] / [θ_fc - θ_wp] ∈ [0, 1]</w:t>
+      </w:r>
+      <w:r>
+        <w:t xml:space="preserve">   </w:t>
+      </w:r>
+      <w:r>
+        <w:rPr>
+          <w:b/>
+          <w:sz w:val="19"/>
+        </w:rPr>
         <w:t>(2)</w:t>
       </w:r>
     </w:p>
     <w:p>
       <w:pPr>
-        <w:spacing w:before="0" w:after="120" w:line="276" w:lineRule="auto"/>
+        <w:spacing w:before="0" w:after="80" w:line="252" w:lineRule="auto"/>
+        <w:ind w:firstLine="202"/>
         <w:jc w:val="both"/>
       </w:pPr>
       <w:r>
@@ -334,25 +531,31 @@
     </w:p>
     <w:p>
       <w:pPr>
-        <w:spacing w:before="80" w:after="80"/>
-        <w:jc w:val="center"/>
+        <w:spacing w:before="60" w:after="60"/>
+        <w:jc w:val="both"/>
       </w:pPr>
       <w:r>
         <w:rPr>
-          <w:rFonts w:ascii="Times New Roman" w:hAnsi="Times New Roman"/>
           <w:i/>
-          <w:sz w:val="20"/>
+          <w:sz w:val="19"/>
         </w:rPr>
-        <w:tab/>
-        <w:t>e(t) = θ_target - θ(t)</w:t>
-        <w:tab/>
+        <w:t xml:space="preserve">    e(t) = θ_target - θ(t)</w:t>
+      </w:r>
+      <w:r>
+        <w:t xml:space="preserve">   </w:t>
+      </w:r>
+      <w:r>
+        <w:rPr>
+          <w:b/>
+          <w:sz w:val="19"/>
+        </w:rPr>
         <w:t>(3)</w:t>
       </w:r>
     </w:p>
     <w:p>
       <w:pPr>
         <w:keepNext/>
-        <w:spacing w:before="200" w:after="80"/>
+        <w:spacing w:before="160" w:after="60"/>
         <w:jc w:val="left"/>
       </w:pPr>
       <w:r>
@@ -367,7 +570,8 @@
     </w:p>
     <w:p>
       <w:pPr>
-        <w:spacing w:before="0" w:after="120" w:line="276" w:lineRule="auto"/>
+        <w:spacing w:before="0" w:after="80" w:line="252" w:lineRule="auto"/>
+        <w:ind w:firstLine="202"/>
         <w:jc w:val="both"/>
       </w:pPr>
       <w:r>
@@ -375,29 +579,36 @@
           <w:rFonts w:ascii="Times New Roman" w:hAnsi="Times New Roman"/>
           <w:sz w:val="20"/>
         </w:rPr>
-        <w:t>Atmospheric evaporative demand is governed by the standard ASCE/FAO-56 Penman-Monteith equation:</w:t>
+        <w:t>Atmospheric evaporative demand is governed by the standard ASCE/FAO-56 Penman-Monteith equation [1]:</w:t>
       </w:r>
     </w:p>
     <w:p>
       <w:pPr>
-        <w:spacing w:before="80" w:after="80"/>
-        <w:jc w:val="center"/>
+        <w:spacing w:before="60" w:after="60"/>
+        <w:jc w:val="both"/>
       </w:pPr>
       <w:r>
         <w:rPr>
-          <w:rFonts w:ascii="Times New Roman" w:hAnsi="Times New Roman"/>
           <w:i/>
-          <w:sz w:val="20"/>
+          <w:sz w:val="19"/>
         </w:rPr>
-        <w:tab/>
-        <w:t>ET₀ = [0.408 Δ (R_n - G) + γ (900 / (T + 273)) u₂ (e_s - e_a)] / [Δ + γ (1 + 0.34 u₂)]</w:t>
-        <w:tab/>
+        <w:t xml:space="preserve">    ET₀ = [0.408 Δ (R_n - G) + γ (900 / (T + 273)) u₂ (e_s - e_a)] / [Δ + γ (1 + 0.34 u₂)]</w:t>
+      </w:r>
+      <w:r>
+        <w:t xml:space="preserve">   </w:t>
+      </w:r>
+      <w:r>
+        <w:rPr>
+          <w:b/>
+          <w:sz w:val="19"/>
+        </w:rPr>
         <w:t>(4)</w:t>
       </w:r>
     </w:p>
     <w:p>
       <w:pPr>
-        <w:spacing w:before="0" w:after="120" w:line="276" w:lineRule="auto"/>
+        <w:spacing w:before="0" w:after="80" w:line="252" w:lineRule="auto"/>
+        <w:ind w:firstLine="202"/>
         <w:jc w:val="both"/>
       </w:pPr>
       <w:r>
@@ -410,24 +621,31 @@
     </w:p>
     <w:p>
       <w:pPr>
-        <w:spacing w:before="80" w:after="80"/>
-        <w:jc w:val="center"/>
+        <w:spacing w:before="60" w:after="60"/>
+        <w:jc w:val="both"/>
       </w:pPr>
       <w:r>
         <w:rPr>
-          <w:rFonts w:ascii="Times New Roman" w:hAnsi="Times New Roman"/>
           <w:i/>
-          <w:sz w:val="20"/>
+          <w:sz w:val="19"/>
         </w:rPr>
-        <w:tab/>
-        <w:t>e_s = 0.6108 · exp[ (17.27 · T) / (T + 237.3) ]</w:t>
-        <w:tab/>
+        <w:t xml:space="preserve">    e_s = 0.6108 · exp[ (17.27 · T) / (T + 237.3) ]</w:t>
+      </w:r>
+      <w:r>
+        <w:t xml:space="preserve">   </w:t>
+      </w:r>
+      <w:r>
+        <w:rPr>
+          <w:b/>
+          <w:sz w:val="19"/>
+        </w:rPr>
         <w:t>(5)</w:t>
       </w:r>
     </w:p>
     <w:p>
       <w:pPr>
-        <w:spacing w:before="0" w:after="120" w:line="276" w:lineRule="auto"/>
+        <w:spacing w:before="0" w:after="80" w:line="252" w:lineRule="auto"/>
+        <w:ind w:firstLine="202"/>
         <w:jc w:val="both"/>
       </w:pPr>
       <w:r>
@@ -440,41 +658,54 @@
     </w:p>
     <w:p>
       <w:pPr>
-        <w:spacing w:before="80" w:after="80"/>
-        <w:jc w:val="center"/>
+        <w:spacing w:before="60" w:after="60"/>
+        <w:jc w:val="both"/>
       </w:pPr>
       <w:r>
         <w:rPr>
-          <w:rFonts w:ascii="Times New Roman" w:hAnsi="Times New Roman"/>
           <w:i/>
-          <w:sz w:val="20"/>
+          <w:sz w:val="19"/>
         </w:rPr>
-        <w:tab/>
-        <w:t>ET_c(t) = K_c(t) · ET₀(t)</w:t>
-        <w:tab/>
+        <w:t xml:space="preserve">    ET_c(t) = K_c(t) · ET₀(t)</w:t>
+      </w:r>
+      <w:r>
+        <w:t xml:space="preserve">   </w:t>
+      </w:r>
+      <w:r>
+        <w:rPr>
+          <w:b/>
+          <w:sz w:val="19"/>
+        </w:rPr>
         <w:t>(6)</w:t>
       </w:r>
     </w:p>
     <w:p>
       <w:pPr>
-        <w:spacing w:before="80" w:after="80"/>
-        <w:jc w:val="center"/>
+        <w:spacing w:before="60" w:after="60"/>
+        <w:jc w:val="both"/>
       </w:pPr>
       <w:r>
         <w:rPr>
-          <w:rFonts w:ascii="Times New Roman" w:hAnsi="Times New Roman"/>
           <w:i/>
-          <w:sz w:val="20"/>
+          <w:sz w:val="19"/>
         </w:rPr>
-        <w:tab/>
-        <w:t>D_net(t) = max(0, ET_c(t) - P_eff(t))</w:t>
-        <w:tab/>
+        <w:t xml:space="preserve">    D_net(t) = max(0, ET_c(t) - P_eff(t))</w:t>
+      </w:r>
+      <w:r>
+        <w:t xml:space="preserve">   </w:t>
+      </w:r>
+      <w:r>
+        <w:rPr>
+          <w:b/>
+          <w:sz w:val="19"/>
+        </w:rPr>
         <w:t>(7)</w:t>
       </w:r>
     </w:p>
     <w:p>
       <w:pPr>
-        <w:spacing w:before="0" w:after="120" w:line="276" w:lineRule="auto"/>
+        <w:spacing w:before="0" w:after="80" w:line="252" w:lineRule="auto"/>
+        <w:ind w:firstLine="202"/>
         <w:jc w:val="both"/>
       </w:pPr>
       <w:r>
@@ -488,7 +719,7 @@
     <w:p>
       <w:pPr>
         <w:keepNext/>
-        <w:spacing w:before="280" w:after="120"/>
+        <w:spacing w:before="200" w:after="80"/>
         <w:jc w:val="center"/>
       </w:pPr>
       <w:r>
@@ -502,7 +733,8 @@
     </w:p>
     <w:p>
       <w:pPr>
-        <w:spacing w:before="0" w:after="120" w:line="276" w:lineRule="auto"/>
+        <w:spacing w:before="0" w:after="80" w:line="252" w:lineRule="auto"/>
+        <w:ind w:firstLine="202"/>
         <w:jc w:val="both"/>
       </w:pPr>
       <w:r>
@@ -516,7 +748,7 @@
     <w:p>
       <w:pPr>
         <w:keepNext/>
-        <w:spacing w:before="200" w:after="80"/>
+        <w:spacing w:before="160" w:after="60"/>
         <w:jc w:val="left"/>
       </w:pPr>
       <w:r>
@@ -531,7 +763,8 @@
     </w:p>
     <w:p>
       <w:pPr>
-        <w:spacing w:before="0" w:after="120" w:line="276" w:lineRule="auto"/>
+        <w:spacing w:before="0" w:after="80" w:line="252" w:lineRule="auto"/>
+        <w:ind w:firstLine="202"/>
         <w:jc w:val="both"/>
       </w:pPr>
       <w:r>
@@ -551,12 +784,13 @@
     <w:p>
       <w:pPr>
         <w:keepNext/>
+        <w:spacing w:before="120" w:after="40"/>
         <w:jc w:val="center"/>
       </w:pPr>
       <w:r>
         <w:rPr>
           <w:b/>
-          <w:sz w:val="17"/>
+          <w:sz w:val="16"/>
         </w:rPr>
         <w:t>TABLE I</w:t>
         <w:br/>
@@ -567,19 +801,26 @@
       <w:tblPr>
         <w:tblW w:type="auto" w:w="0"/>
         <w:jc w:val="center"/>
+        <w:tblLayout w:type="fixed"/>
         <w:tblLook w:firstColumn="1" w:firstRow="1" w:lastColumn="0" w:lastRow="0" w:noHBand="0" w:noVBand="1" w:val="04A0"/>
       </w:tblPr>
       <w:tblGrid>
-        <w:gridCol w:w="2556"/>
-        <w:gridCol w:w="2556"/>
-        <w:gridCol w:w="2556"/>
-        <w:gridCol w:w="2556"/>
+        <w:gridCol w:w="2610"/>
+        <w:gridCol w:w="2610"/>
+        <w:gridCol w:w="2610"/>
+        <w:gridCol w:w="2610"/>
       </w:tblGrid>
       <w:tr>
         <w:tc>
           <w:tcPr>
-            <w:tcW w:type="dxa" w:w="2556"/>
+            <w:tcW w:type="dxa" w:w="792"/>
             <w:shd w:fill="E2E8F0"/>
+            <w:tcMar>
+              <w:top w:w="40" w:type="dxa"/>
+              <w:bottom w:w="40" w:type="dxa"/>
+              <w:left w:w="40" w:type="dxa"/>
+              <w:right w:w="40" w:type="dxa"/>
+            </w:tcMar>
           </w:tcPr>
           <w:p>
             <w:pPr>
@@ -588,16 +829,22 @@
             <w:r>
               <w:rPr>
                 <w:b/>
-                <w:sz w:val="17"/>
+                <w:sz w:val="15"/>
               </w:rPr>
-              <w:t>Rule ID</w:t>
+              <w:t>Rule</w:t>
             </w:r>
           </w:p>
         </w:tc>
         <w:tc>
           <w:tcPr>
-            <w:tcW w:type="dxa" w:w="2556"/>
+            <w:tcW w:type="dxa" w:w="1368"/>
             <w:shd w:fill="E2E8F0"/>
+            <w:tcMar>
+              <w:top w:w="40" w:type="dxa"/>
+              <w:bottom w:w="40" w:type="dxa"/>
+              <w:left w:w="40" w:type="dxa"/>
+              <w:right w:w="40" w:type="dxa"/>
+            </w:tcMar>
           </w:tcPr>
           <w:p>
             <w:pPr>
@@ -606,16 +853,22 @@
             <w:r>
               <w:rPr>
                 <w:b/>
-                <w:sz w:val="17"/>
+                <w:sz w:val="15"/>
               </w:rPr>
-              <w:t>Antecedent 1: RSM</w:t>
+              <w:t>RSM</w:t>
             </w:r>
           </w:p>
         </w:tc>
         <w:tc>
           <w:tcPr>
-            <w:tcW w:type="dxa" w:w="2556"/>
+            <w:tcW w:type="dxa" w:w="1584"/>
             <w:shd w:fill="E2E8F0"/>
+            <w:tcMar>
+              <w:top w:w="40" w:type="dxa"/>
+              <w:bottom w:w="40" w:type="dxa"/>
+              <w:left w:w="40" w:type="dxa"/>
+              <w:right w:w="40" w:type="dxa"/>
+            </w:tcMar>
           </w:tcPr>
           <w:p>
             <w:pPr>
@@ -624,16 +877,22 @@
             <w:r>
               <w:rPr>
                 <w:b/>
-                <w:sz w:val="17"/>
+                <w:sz w:val="15"/>
               </w:rPr>
-              <w:t>Antecedent 2: Error e(t)</w:t>
+              <w:t>Error e(t)</w:t>
             </w:r>
           </w:p>
         </w:tc>
         <w:tc>
           <w:tcPr>
-            <w:tcW w:type="dxa" w:w="2556"/>
+            <w:tcW w:type="dxa" w:w="1296"/>
             <w:shd w:fill="E2E8F0"/>
+            <w:tcMar>
+              <w:top w:w="40" w:type="dxa"/>
+              <w:bottom w:w="40" w:type="dxa"/>
+              <w:left w:w="40" w:type="dxa"/>
+              <w:right w:w="40" w:type="dxa"/>
+            </w:tcMar>
           </w:tcPr>
           <w:p>
             <w:pPr>
@@ -642,9 +901,9 @@
             <w:r>
               <w:rPr>
                 <w:b/>
-                <w:sz w:val="17"/>
+                <w:sz w:val="15"/>
               </w:rPr>
-              <w:t>Consequent: S_soil</w:t>
+              <w:t>S_soil</w:t>
             </w:r>
           </w:p>
         </w:tc>
@@ -652,7 +911,13 @@
       <w:tr>
         <w:tc>
           <w:tcPr>
-            <w:tcW w:type="dxa" w:w="2556"/>
+            <w:tcW w:type="dxa" w:w="792"/>
+            <w:tcMar>
+              <w:top w:w="30" w:type="dxa"/>
+              <w:bottom w:w="30" w:type="dxa"/>
+              <w:left w:w="30" w:type="dxa"/>
+              <w:right w:w="30" w:type="dxa"/>
+            </w:tcMar>
           </w:tcPr>
           <w:p>
             <w:pPr>
@@ -660,7 +925,7 @@
             </w:pPr>
             <w:r>
               <w:rPr>
-                <w:sz w:val="17"/>
+                <w:sz w:val="15"/>
               </w:rPr>
               <w:t>R1,1</w:t>
             </w:r>
@@ -668,12 +933,18 @@
         </w:tc>
         <w:tc>
           <w:tcPr>
-            <w:tcW w:type="dxa" w:w="2556"/>
+            <w:tcW w:type="dxa" w:w="1368"/>
+            <w:tcMar>
+              <w:top w:w="30" w:type="dxa"/>
+              <w:bottom w:w="30" w:type="dxa"/>
+              <w:left w:w="30" w:type="dxa"/>
+              <w:right w:w="30" w:type="dxa"/>
+            </w:tcMar>
           </w:tcPr>
           <w:p>
             <w:r>
               <w:rPr>
-                <w:sz w:val="17"/>
+                <w:sz w:val="15"/>
               </w:rPr>
               <w:t>Very Dry</w:t>
             </w:r>
@@ -681,25 +952,37 @@
         </w:tc>
         <w:tc>
           <w:tcPr>
-            <w:tcW w:type="dxa" w:w="2556"/>
+            <w:tcW w:type="dxa" w:w="1584"/>
+            <w:tcMar>
+              <w:top w:w="30" w:type="dxa"/>
+              <w:bottom w:w="30" w:type="dxa"/>
+              <w:left w:w="30" w:type="dxa"/>
+              <w:right w:w="30" w:type="dxa"/>
+            </w:tcMar>
           </w:tcPr>
           <w:p>
             <w:r>
               <w:rPr>
-                <w:sz w:val="17"/>
+                <w:sz w:val="15"/>
               </w:rPr>
-              <w:t>Positive Large</w:t>
+              <w:t>Pos. Large</w:t>
             </w:r>
           </w:p>
         </w:tc>
         <w:tc>
           <w:tcPr>
-            <w:tcW w:type="dxa" w:w="2556"/>
+            <w:tcW w:type="dxa" w:w="1296"/>
+            <w:tcMar>
+              <w:top w:w="30" w:type="dxa"/>
+              <w:bottom w:w="30" w:type="dxa"/>
+              <w:left w:w="30" w:type="dxa"/>
+              <w:right w:w="30" w:type="dxa"/>
+            </w:tcMar>
           </w:tcPr>
           <w:p>
             <w:r>
               <w:rPr>
-                <w:sz w:val="17"/>
+                <w:sz w:val="15"/>
               </w:rPr>
               <w:t>Severe (100%)</w:t>
             </w:r>
@@ -709,7 +992,13 @@
       <w:tr>
         <w:tc>
           <w:tcPr>
-            <w:tcW w:type="dxa" w:w="2556"/>
+            <w:tcW w:type="dxa" w:w="792"/>
+            <w:tcMar>
+              <w:top w:w="30" w:type="dxa"/>
+              <w:bottom w:w="30" w:type="dxa"/>
+              <w:left w:w="30" w:type="dxa"/>
+              <w:right w:w="30" w:type="dxa"/>
+            </w:tcMar>
           </w:tcPr>
           <w:p>
             <w:pPr>
@@ -717,7 +1006,7 @@
             </w:pPr>
             <w:r>
               <w:rPr>
-                <w:sz w:val="17"/>
+                <w:sz w:val="15"/>
               </w:rPr>
               <w:t>R1,2</w:t>
             </w:r>
@@ -725,12 +1014,18 @@
         </w:tc>
         <w:tc>
           <w:tcPr>
-            <w:tcW w:type="dxa" w:w="2556"/>
+            <w:tcW w:type="dxa" w:w="1368"/>
+            <w:tcMar>
+              <w:top w:w="30" w:type="dxa"/>
+              <w:bottom w:w="30" w:type="dxa"/>
+              <w:left w:w="30" w:type="dxa"/>
+              <w:right w:w="30" w:type="dxa"/>
+            </w:tcMar>
           </w:tcPr>
           <w:p>
             <w:r>
               <w:rPr>
-                <w:sz w:val="17"/>
+                <w:sz w:val="15"/>
               </w:rPr>
               <w:t>Very Dry</w:t>
             </w:r>
@@ -738,12 +1033,18 @@
         </w:tc>
         <w:tc>
           <w:tcPr>
-            <w:tcW w:type="dxa" w:w="2556"/>
+            <w:tcW w:type="dxa" w:w="1584"/>
+            <w:tcMar>
+              <w:top w:w="30" w:type="dxa"/>
+              <w:bottom w:w="30" w:type="dxa"/>
+              <w:left w:w="30" w:type="dxa"/>
+              <w:right w:w="30" w:type="dxa"/>
+            </w:tcMar>
           </w:tcPr>
           <w:p>
             <w:r>
               <w:rPr>
-                <w:sz w:val="17"/>
+                <w:sz w:val="15"/>
               </w:rPr>
               <w:t>Positive</w:t>
             </w:r>
@@ -751,12 +1052,18 @@
         </w:tc>
         <w:tc>
           <w:tcPr>
-            <w:tcW w:type="dxa" w:w="2556"/>
+            <w:tcW w:type="dxa" w:w="1296"/>
+            <w:tcMar>
+              <w:top w:w="30" w:type="dxa"/>
+              <w:bottom w:w="30" w:type="dxa"/>
+              <w:left w:w="30" w:type="dxa"/>
+              <w:right w:w="30" w:type="dxa"/>
+            </w:tcMar>
           </w:tcPr>
           <w:p>
             <w:r>
               <w:rPr>
-                <w:sz w:val="17"/>
+                <w:sz w:val="15"/>
               </w:rPr>
               <w:t>High (80%)</w:t>
             </w:r>
@@ -766,7 +1073,13 @@
       <w:tr>
         <w:tc>
           <w:tcPr>
-            <w:tcW w:type="dxa" w:w="2556"/>
+            <w:tcW w:type="dxa" w:w="792"/>
+            <w:tcMar>
+              <w:top w:w="30" w:type="dxa"/>
+              <w:bottom w:w="30" w:type="dxa"/>
+              <w:left w:w="30" w:type="dxa"/>
+              <w:right w:w="30" w:type="dxa"/>
+            </w:tcMar>
           </w:tcPr>
           <w:p>
             <w:pPr>
@@ -774,7 +1087,7 @@
             </w:pPr>
             <w:r>
               <w:rPr>
-                <w:sz w:val="17"/>
+                <w:sz w:val="15"/>
               </w:rPr>
               <w:t>R1,3</w:t>
             </w:r>
@@ -782,12 +1095,18 @@
         </w:tc>
         <w:tc>
           <w:tcPr>
-            <w:tcW w:type="dxa" w:w="2556"/>
+            <w:tcW w:type="dxa" w:w="1368"/>
+            <w:tcMar>
+              <w:top w:w="30" w:type="dxa"/>
+              <w:bottom w:w="30" w:type="dxa"/>
+              <w:left w:w="30" w:type="dxa"/>
+              <w:right w:w="30" w:type="dxa"/>
+            </w:tcMar>
           </w:tcPr>
           <w:p>
             <w:r>
               <w:rPr>
-                <w:sz w:val="17"/>
+                <w:sz w:val="15"/>
               </w:rPr>
               <w:t>Dry</w:t>
             </w:r>
@@ -795,25 +1114,37 @@
         </w:tc>
         <w:tc>
           <w:tcPr>
-            <w:tcW w:type="dxa" w:w="2556"/>
+            <w:tcW w:type="dxa" w:w="1584"/>
+            <w:tcMar>
+              <w:top w:w="30" w:type="dxa"/>
+              <w:bottom w:w="30" w:type="dxa"/>
+              <w:left w:w="30" w:type="dxa"/>
+              <w:right w:w="30" w:type="dxa"/>
+            </w:tcMar>
           </w:tcPr>
           <w:p>
             <w:r>
               <w:rPr>
-                <w:sz w:val="17"/>
+                <w:sz w:val="15"/>
               </w:rPr>
-              <w:t>Positive Large</w:t>
+              <w:t>Pos. Large</w:t>
             </w:r>
           </w:p>
         </w:tc>
         <w:tc>
           <w:tcPr>
-            <w:tcW w:type="dxa" w:w="2556"/>
+            <w:tcW w:type="dxa" w:w="1296"/>
+            <w:tcMar>
+              <w:top w:w="30" w:type="dxa"/>
+              <w:bottom w:w="30" w:type="dxa"/>
+              <w:left w:w="30" w:type="dxa"/>
+              <w:right w:w="30" w:type="dxa"/>
+            </w:tcMar>
           </w:tcPr>
           <w:p>
             <w:r>
               <w:rPr>
-                <w:sz w:val="17"/>
+                <w:sz w:val="15"/>
               </w:rPr>
               <w:t>High (80%)</w:t>
             </w:r>
@@ -823,7 +1154,13 @@
       <w:tr>
         <w:tc>
           <w:tcPr>
-            <w:tcW w:type="dxa" w:w="2556"/>
+            <w:tcW w:type="dxa" w:w="792"/>
+            <w:tcMar>
+              <w:top w:w="30" w:type="dxa"/>
+              <w:bottom w:w="30" w:type="dxa"/>
+              <w:left w:w="30" w:type="dxa"/>
+              <w:right w:w="30" w:type="dxa"/>
+            </w:tcMar>
           </w:tcPr>
           <w:p>
             <w:pPr>
@@ -831,7 +1168,7 @@
             </w:pPr>
             <w:r>
               <w:rPr>
-                <w:sz w:val="17"/>
+                <w:sz w:val="15"/>
               </w:rPr>
               <w:t>R1,4</w:t>
             </w:r>
@@ -839,12 +1176,18 @@
         </w:tc>
         <w:tc>
           <w:tcPr>
-            <w:tcW w:type="dxa" w:w="2556"/>
+            <w:tcW w:type="dxa" w:w="1368"/>
+            <w:tcMar>
+              <w:top w:w="30" w:type="dxa"/>
+              <w:bottom w:w="30" w:type="dxa"/>
+              <w:left w:w="30" w:type="dxa"/>
+              <w:right w:w="30" w:type="dxa"/>
+            </w:tcMar>
           </w:tcPr>
           <w:p>
             <w:r>
               <w:rPr>
-                <w:sz w:val="17"/>
+                <w:sz w:val="15"/>
               </w:rPr>
               <w:t>Dry</w:t>
             </w:r>
@@ -852,12 +1195,18 @@
         </w:tc>
         <w:tc>
           <w:tcPr>
-            <w:tcW w:type="dxa" w:w="2556"/>
+            <w:tcW w:type="dxa" w:w="1584"/>
+            <w:tcMar>
+              <w:top w:w="30" w:type="dxa"/>
+              <w:bottom w:w="30" w:type="dxa"/>
+              <w:left w:w="30" w:type="dxa"/>
+              <w:right w:w="30" w:type="dxa"/>
+            </w:tcMar>
           </w:tcPr>
           <w:p>
             <w:r>
               <w:rPr>
-                <w:sz w:val="17"/>
+                <w:sz w:val="15"/>
               </w:rPr>
               <w:t>Positive</w:t>
             </w:r>
@@ -865,14 +1214,20 @@
         </w:tc>
         <w:tc>
           <w:tcPr>
-            <w:tcW w:type="dxa" w:w="2556"/>
+            <w:tcW w:type="dxa" w:w="1296"/>
+            <w:tcMar>
+              <w:top w:w="30" w:type="dxa"/>
+              <w:bottom w:w="30" w:type="dxa"/>
+              <w:left w:w="30" w:type="dxa"/>
+              <w:right w:w="30" w:type="dxa"/>
+            </w:tcMar>
           </w:tcPr>
           <w:p>
             <w:r>
               <w:rPr>
-                <w:sz w:val="17"/>
+                <w:sz w:val="15"/>
               </w:rPr>
-              <w:t>Moderate (50%)</w:t>
+              <w:t>Mod. (50%)</w:t>
             </w:r>
           </w:p>
         </w:tc>
@@ -880,7 +1235,13 @@
       <w:tr>
         <w:tc>
           <w:tcPr>
-            <w:tcW w:type="dxa" w:w="2556"/>
+            <w:tcW w:type="dxa" w:w="792"/>
+            <w:tcMar>
+              <w:top w:w="30" w:type="dxa"/>
+              <w:bottom w:w="30" w:type="dxa"/>
+              <w:left w:w="30" w:type="dxa"/>
+              <w:right w:w="30" w:type="dxa"/>
+            </w:tcMar>
           </w:tcPr>
           <w:p>
             <w:pPr>
@@ -888,7 +1249,7 @@
             </w:pPr>
             <w:r>
               <w:rPr>
-                <w:sz w:val="17"/>
+                <w:sz w:val="15"/>
               </w:rPr>
               <w:t>R1,5</w:t>
             </w:r>
@@ -896,12 +1257,18 @@
         </w:tc>
         <w:tc>
           <w:tcPr>
-            <w:tcW w:type="dxa" w:w="2556"/>
+            <w:tcW w:type="dxa" w:w="1368"/>
+            <w:tcMar>
+              <w:top w:w="30" w:type="dxa"/>
+              <w:bottom w:w="30" w:type="dxa"/>
+              <w:left w:w="30" w:type="dxa"/>
+              <w:right w:w="30" w:type="dxa"/>
+            </w:tcMar>
           </w:tcPr>
           <w:p>
             <w:r>
               <w:rPr>
-                <w:sz w:val="17"/>
+                <w:sz w:val="15"/>
               </w:rPr>
               <w:t>Optimal</w:t>
             </w:r>
@@ -909,12 +1276,18 @@
         </w:tc>
         <w:tc>
           <w:tcPr>
-            <w:tcW w:type="dxa" w:w="2556"/>
+            <w:tcW w:type="dxa" w:w="1584"/>
+            <w:tcMar>
+              <w:top w:w="30" w:type="dxa"/>
+              <w:bottom w:w="30" w:type="dxa"/>
+              <w:left w:w="30" w:type="dxa"/>
+              <w:right w:w="30" w:type="dxa"/>
+            </w:tcMar>
           </w:tcPr>
           <w:p>
             <w:r>
               <w:rPr>
-                <w:sz w:val="17"/>
+                <w:sz w:val="15"/>
               </w:rPr>
               <w:t>Zero</w:t>
             </w:r>
@@ -922,12 +1295,18 @@
         </w:tc>
         <w:tc>
           <w:tcPr>
-            <w:tcW w:type="dxa" w:w="2556"/>
+            <w:tcW w:type="dxa" w:w="1296"/>
+            <w:tcMar>
+              <w:top w:w="30" w:type="dxa"/>
+              <w:bottom w:w="30" w:type="dxa"/>
+              <w:left w:w="30" w:type="dxa"/>
+              <w:right w:w="30" w:type="dxa"/>
+            </w:tcMar>
           </w:tcPr>
           <w:p>
             <w:r>
               <w:rPr>
-                <w:sz w:val="17"/>
+                <w:sz w:val="15"/>
               </w:rPr>
               <w:t>Low (20%)</w:t>
             </w:r>
@@ -937,7 +1316,13 @@
       <w:tr>
         <w:tc>
           <w:tcPr>
-            <w:tcW w:type="dxa" w:w="2556"/>
+            <w:tcW w:type="dxa" w:w="792"/>
+            <w:tcMar>
+              <w:top w:w="30" w:type="dxa"/>
+              <w:bottom w:w="30" w:type="dxa"/>
+              <w:left w:w="30" w:type="dxa"/>
+              <w:right w:w="30" w:type="dxa"/>
+            </w:tcMar>
           </w:tcPr>
           <w:p>
             <w:pPr>
@@ -945,7 +1330,7 @@
             </w:pPr>
             <w:r>
               <w:rPr>
-                <w:sz w:val="17"/>
+                <w:sz w:val="15"/>
               </w:rPr>
               <w:t>R1,6</w:t>
             </w:r>
@@ -953,12 +1338,18 @@
         </w:tc>
         <w:tc>
           <w:tcPr>
-            <w:tcW w:type="dxa" w:w="2556"/>
+            <w:tcW w:type="dxa" w:w="1368"/>
+            <w:tcMar>
+              <w:top w:w="30" w:type="dxa"/>
+              <w:bottom w:w="30" w:type="dxa"/>
+              <w:left w:w="30" w:type="dxa"/>
+              <w:right w:w="30" w:type="dxa"/>
+            </w:tcMar>
           </w:tcPr>
           <w:p>
             <w:r>
               <w:rPr>
-                <w:sz w:val="17"/>
+                <w:sz w:val="15"/>
               </w:rPr>
               <w:t>Optimal</w:t>
             </w:r>
@@ -966,12 +1357,18 @@
         </w:tc>
         <w:tc>
           <w:tcPr>
-            <w:tcW w:type="dxa" w:w="2556"/>
+            <w:tcW w:type="dxa" w:w="1584"/>
+            <w:tcMar>
+              <w:top w:w="30" w:type="dxa"/>
+              <w:bottom w:w="30" w:type="dxa"/>
+              <w:left w:w="30" w:type="dxa"/>
+              <w:right w:w="30" w:type="dxa"/>
+            </w:tcMar>
           </w:tcPr>
           <w:p>
             <w:r>
               <w:rPr>
-                <w:sz w:val="17"/>
+                <w:sz w:val="15"/>
               </w:rPr>
               <w:t>Negative</w:t>
             </w:r>
@@ -979,12 +1376,18 @@
         </w:tc>
         <w:tc>
           <w:tcPr>
-            <w:tcW w:type="dxa" w:w="2556"/>
+            <w:tcW w:type="dxa" w:w="1296"/>
+            <w:tcMar>
+              <w:top w:w="30" w:type="dxa"/>
+              <w:bottom w:w="30" w:type="dxa"/>
+              <w:left w:w="30" w:type="dxa"/>
+              <w:right w:w="30" w:type="dxa"/>
+            </w:tcMar>
           </w:tcPr>
           <w:p>
             <w:r>
               <w:rPr>
-                <w:sz w:val="17"/>
+                <w:sz w:val="15"/>
               </w:rPr>
               <w:t>Negligible (0%)</w:t>
             </w:r>
@@ -994,7 +1397,13 @@
       <w:tr>
         <w:tc>
           <w:tcPr>
-            <w:tcW w:type="dxa" w:w="2556"/>
+            <w:tcW w:type="dxa" w:w="792"/>
+            <w:tcMar>
+              <w:top w:w="30" w:type="dxa"/>
+              <w:bottom w:w="30" w:type="dxa"/>
+              <w:left w:w="30" w:type="dxa"/>
+              <w:right w:w="30" w:type="dxa"/>
+            </w:tcMar>
           </w:tcPr>
           <w:p>
             <w:pPr>
@@ -1002,7 +1411,7 @@
             </w:pPr>
             <w:r>
               <w:rPr>
-                <w:sz w:val="17"/>
+                <w:sz w:val="15"/>
               </w:rPr>
               <w:t>R1,7</w:t>
             </w:r>
@@ -1010,12 +1419,18 @@
         </w:tc>
         <w:tc>
           <w:tcPr>
-            <w:tcW w:type="dxa" w:w="2556"/>
+            <w:tcW w:type="dxa" w:w="1368"/>
+            <w:tcMar>
+              <w:top w:w="30" w:type="dxa"/>
+              <w:bottom w:w="30" w:type="dxa"/>
+              <w:left w:w="30" w:type="dxa"/>
+              <w:right w:w="30" w:type="dxa"/>
+            </w:tcMar>
           </w:tcPr>
           <w:p>
             <w:r>
               <w:rPr>
-                <w:sz w:val="17"/>
+                <w:sz w:val="15"/>
               </w:rPr>
               <w:t>Wet</w:t>
             </w:r>
@@ -1023,25 +1438,37 @@
         </w:tc>
         <w:tc>
           <w:tcPr>
-            <w:tcW w:type="dxa" w:w="2556"/>
+            <w:tcW w:type="dxa" w:w="1584"/>
+            <w:tcMar>
+              <w:top w:w="30" w:type="dxa"/>
+              <w:bottom w:w="30" w:type="dxa"/>
+              <w:left w:w="30" w:type="dxa"/>
+              <w:right w:w="30" w:type="dxa"/>
+            </w:tcMar>
           </w:tcPr>
           <w:p>
             <w:r>
               <w:rPr>
-                <w:sz w:val="17"/>
+                <w:sz w:val="15"/>
               </w:rPr>
-              <w:t>Negative Large</w:t>
+              <w:t>Neg. Large</w:t>
             </w:r>
           </w:p>
         </w:tc>
         <w:tc>
           <w:tcPr>
-            <w:tcW w:type="dxa" w:w="2556"/>
+            <w:tcW w:type="dxa" w:w="1296"/>
+            <w:tcMar>
+              <w:top w:w="30" w:type="dxa"/>
+              <w:bottom w:w="30" w:type="dxa"/>
+              <w:left w:w="30" w:type="dxa"/>
+              <w:right w:w="30" w:type="dxa"/>
+            </w:tcMar>
           </w:tcPr>
           <w:p>
             <w:r>
               <w:rPr>
-                <w:sz w:val="17"/>
+                <w:sz w:val="15"/>
               </w:rPr>
               <w:t>Negligible (0%)</w:t>
             </w:r>
@@ -1052,7 +1479,7 @@
     <w:p>
       <w:pPr>
         <w:keepNext/>
-        <w:spacing w:before="200" w:after="80"/>
+        <w:spacing w:before="160" w:after="60"/>
         <w:jc w:val="left"/>
       </w:pPr>
       <w:r>
@@ -1067,7 +1494,8 @@
     </w:p>
     <w:p>
       <w:pPr>
-        <w:spacing w:before="0" w:after="120" w:line="276" w:lineRule="auto"/>
+        <w:spacing w:before="0" w:after="80" w:line="252" w:lineRule="auto"/>
+        <w:ind w:firstLine="202"/>
         <w:jc w:val="both"/>
       </w:pPr>
       <w:r>
@@ -1081,7 +1509,7 @@
     <w:p>
       <w:pPr>
         <w:keepNext/>
-        <w:spacing w:before="200" w:after="80"/>
+        <w:spacing w:before="160" w:after="60"/>
         <w:jc w:val="left"/>
       </w:pPr>
       <w:r>
@@ -1096,7 +1524,8 @@
     </w:p>
     <w:p>
       <w:pPr>
-        <w:spacing w:before="0" w:after="120" w:line="276" w:lineRule="auto"/>
+        <w:spacing w:before="0" w:after="80" w:line="252" w:lineRule="auto"/>
+        <w:ind w:firstLine="202"/>
         <w:jc w:val="both"/>
       </w:pPr>
       <w:r>
@@ -1110,7 +1539,7 @@
     <w:p>
       <w:pPr>
         <w:keepNext/>
-        <w:spacing w:before="200" w:after="80"/>
+        <w:spacing w:before="160" w:after="60"/>
         <w:jc w:val="left"/>
       </w:pPr>
       <w:r>
@@ -1120,12 +1549,13 @@
           <w:i/>
           <w:sz w:val="20"/>
         </w:rPr>
-        <w:t>D. Stage 4: Master Supervisory Valve FIS &amp; 4-Layer Safety Kernel</w:t>
+        <w:t>D. Stage 4: Master Supervisory Valve FIS &amp; Safety Kernel</w:t>
       </w:r>
     </w:p>
     <w:p>
       <w:pPr>
-        <w:spacing w:before="0" w:after="120" w:line="276" w:lineRule="auto"/>
+        <w:spacing w:before="0" w:after="80" w:line="252" w:lineRule="auto"/>
+        <w:ind w:firstLine="202"/>
         <w:jc w:val="both"/>
       </w:pPr>
       <w:r>
@@ -1138,24 +1568,31 @@
     </w:p>
     <w:p>
       <w:pPr>
-        <w:spacing w:before="80" w:after="80"/>
-        <w:jc w:val="center"/>
+        <w:spacing w:before="60" w:after="60"/>
+        <w:jc w:val="both"/>
       </w:pPr>
       <w:r>
         <w:rPr>
-          <w:rFonts w:ascii="Times New Roman" w:hAnsi="Times New Roman"/>
           <w:i/>
-          <w:sz w:val="20"/>
+          <w:sz w:val="19"/>
         </w:rPr>
-        <w:tab/>
-        <w:t>U_final = K_safety(U_raw, T, P_rain, θ)</w:t>
-        <w:tab/>
+        <w:t xml:space="preserve">    U_final = K_safety(U_raw, T, P_rain, θ)</w:t>
+      </w:r>
+      <w:r>
+        <w:t xml:space="preserve">   </w:t>
+      </w:r>
+      <w:r>
+        <w:rPr>
+          <w:b/>
+          <w:sz w:val="19"/>
+        </w:rPr>
         <w:t>(8)</w:t>
       </w:r>
     </w:p>
     <w:p>
       <w:pPr>
-        <w:spacing w:before="0" w:after="120" w:line="276" w:lineRule="auto"/>
+        <w:spacing w:before="0" w:after="80" w:line="252" w:lineRule="auto"/>
+        <w:ind w:firstLine="202"/>
         <w:jc w:val="both"/>
       </w:pPr>
       <w:r>
@@ -1176,7 +1613,8 @@
     </w:p>
     <w:p>
       <w:pPr>
-        <w:spacing w:before="0" w:after="120" w:line="276" w:lineRule="auto"/>
+        <w:spacing w:before="0" w:after="80" w:line="252" w:lineRule="auto"/>
+        <w:ind w:firstLine="202"/>
         <w:jc w:val="both"/>
       </w:pPr>
       <w:r>
@@ -1190,7 +1628,7 @@
     <w:p>
       <w:pPr>
         <w:keepNext/>
-        <w:spacing w:before="200" w:after="80"/>
+        <w:spacing w:before="160" w:after="60"/>
         <w:jc w:val="left"/>
       </w:pPr>
       <w:r>
@@ -1205,7 +1643,8 @@
     </w:p>
     <w:p>
       <w:pPr>
-        <w:spacing w:before="0" w:after="120" w:line="276" w:lineRule="auto"/>
+        <w:spacing w:before="0" w:after="80" w:line="252" w:lineRule="auto"/>
+        <w:ind w:firstLine="202"/>
         <w:jc w:val="both"/>
       </w:pPr>
       <w:r>
@@ -1218,41 +1657,54 @@
     </w:p>
     <w:p>
       <w:pPr>
-        <w:spacing w:before="80" w:after="80"/>
-        <w:jc w:val="center"/>
+        <w:spacing w:before="60" w:after="60"/>
+        <w:jc w:val="both"/>
       </w:pPr>
       <w:r>
         <w:rPr>
-          <w:rFonts w:ascii="Times New Roman" w:hAnsi="Times New Roman"/>
           <w:i/>
-          <w:sz w:val="20"/>
+          <w:sz w:val="19"/>
         </w:rPr>
-        <w:tab/>
-        <w:t>max_{Q_1, ..., Q_N} ∑_{i=1}^N w_i · ln(1 + Q_i / V_req,i)</w:t>
-        <w:tab/>
+        <w:t xml:space="preserve">    max_{Q_i} ∑_{i=1}^N w_i · ln(1 + Q_i / V_req,i)</w:t>
+      </w:r>
+      <w:r>
+        <w:t xml:space="preserve">   </w:t>
+      </w:r>
+      <w:r>
+        <w:rPr>
+          <w:b/>
+          <w:sz w:val="19"/>
+        </w:rPr>
         <w:t>(9)</w:t>
       </w:r>
     </w:p>
     <w:p>
       <w:pPr>
-        <w:spacing w:before="80" w:after="80"/>
-        <w:jc w:val="center"/>
+        <w:spacing w:before="60" w:after="60"/>
+        <w:jc w:val="both"/>
       </w:pPr>
       <w:r>
         <w:rPr>
-          <w:rFonts w:ascii="Times New Roman" w:hAnsi="Times New Roman"/>
           <w:i/>
-          <w:sz w:val="20"/>
+          <w:sz w:val="19"/>
         </w:rPr>
-        <w:tab/>
-        <w:t>subject to: ∑_{i=1}^N Q_i ≤ V_available,  0 ≤ Q_i ≤ V_req,i</w:t>
-        <w:tab/>
+        <w:t xml:space="preserve">    s.t. ∑_{i=1}^N Q_i ≤ V_available,  0 ≤ Q_i ≤ V_req,i</w:t>
+      </w:r>
+      <w:r>
+        <w:t xml:space="preserve">   </w:t>
+      </w:r>
+      <w:r>
+        <w:rPr>
+          <w:b/>
+          <w:sz w:val="19"/>
+        </w:rPr>
         <w:t>(10)</w:t>
       </w:r>
     </w:p>
     <w:p>
       <w:pPr>
-        <w:spacing w:before="0" w:after="120" w:line="276" w:lineRule="auto"/>
+        <w:spacing w:before="0" w:after="80" w:line="252" w:lineRule="auto"/>
+        <w:ind w:firstLine="202"/>
         <w:jc w:val="both"/>
       </w:pPr>
       <w:r>
@@ -1262,18 +1714,17 @@
         </w:rPr>
         <w:t>Theorem 1 (Hard Mass Conservation Invariant): For any non-negative available reservoir volume V_available ≥ 0 and any request vector {V_req,i}, the optimal allocated volume vector Q* = [Q_1*, ..., Q_N*]^T strictly satisfies:</w:t>
         <w:br/>
-        <w:tab/>
-        <w:t>∑_{i=1}^N Q_i* ≤ V_available</w:t>
+        <w:t xml:space="preserve">    ∑_{i=1}^N Q_i* ≤ V_available</w:t>
         <w:br/>
         <w:t>with numerical mass conservation residual error:</w:t>
         <w:br/>
-        <w:tab/>
-        <w:t>ε_mass = | ∑_{i=1}^N Q_i* - min(V_available, ∑_{i=1}^N V_req,i) | &lt; 10⁻⁶ mm.</w:t>
+        <w:t xml:space="preserve">    ε_mass = | ∑_{i=1}^N Q_i* - min(V_available, ∑_{i=1}^N V_req,i) | &lt; 10⁻⁶ mm.</w:t>
       </w:r>
     </w:p>
     <w:p>
       <w:pPr>
-        <w:spacing w:before="0" w:after="120" w:line="276" w:lineRule="auto"/>
+        <w:spacing w:before="0" w:after="80" w:line="252" w:lineRule="auto"/>
+        <w:ind w:firstLine="202"/>
         <w:jc w:val="both"/>
       </w:pPr>
       <w:r>
@@ -1287,7 +1738,7 @@
     <w:p>
       <w:pPr>
         <w:keepNext/>
-        <w:spacing w:before="280" w:after="120"/>
+        <w:spacing w:before="200" w:after="80"/>
         <w:jc w:val="center"/>
       </w:pPr>
       <w:r>
@@ -1301,7 +1752,8 @@
     </w:p>
     <w:p>
       <w:pPr>
-        <w:spacing w:before="0" w:after="120" w:line="276" w:lineRule="auto"/>
+        <w:spacing w:before="0" w:after="80" w:line="252" w:lineRule="auto"/>
+        <w:ind w:firstLine="202"/>
         <w:jc w:val="both"/>
       </w:pPr>
       <w:r>
@@ -1310,20 +1762,68 @@
           <w:sz w:val="20"/>
         </w:rPr>
         <w:t>The cyber-physical platform integrates vector Leaflet WebGIS maps with dynamic spatial indexing. Upon operator selection of any coordinate (φ, λ) across India:</w:t>
-        <w:br/>
-        <w:t>1) ICAR Database Query: The location is reverse-indexed against fifteen Indian Council of Agricultural Research (ICAR) agro-climatic sub-basins, extracting dominant soil taxonomy (Inceptisols, Vertisols, Alfisols, Aridisols) and baseline horizons (θ_fc, θ_wp, θ_sat).</w:t>
-        <w:br/>
-        <w:t>2) Atmospheric Ingestion: Live REST queries to Open-Meteo yield real-time T, RH, R_s, u₂, and precipitation P.</w:t>
-        <w:br/>
-        <w:t>3) Cascaded Execution: The five fuzzy engines compute sequentially within an average execution latency of 18.2 ms.</w:t>
-        <w:br/>
-        <w:t>4) Actuator Manifold Modulation: The resulting aperture U_final is converted into Solenoid Pulse Width Modulation (PWM) duty cycles and orifice discharge flow rates: Q_i = C_d A_orifice √(2 ΔP / ρ_w) [L·min⁻¹].</w:t>
+      </w:r>
+    </w:p>
+    <w:p>
+      <w:pPr>
+        <w:spacing w:before="0" w:after="40" w:line="252" w:lineRule="auto"/>
+        <w:ind w:left="259" w:hanging="173"/>
+        <w:jc w:val="both"/>
+      </w:pPr>
+      <w:r>
+        <w:rPr>
+          <w:rFonts w:ascii="Times New Roman" w:hAnsi="Times New Roman"/>
+          <w:sz w:val="19"/>
+        </w:rPr>
+        <w:t>• ICAR Database Query: The location is reverse-indexed against fifteen Indian Council of Agricultural Research (ICAR) agro-climatic sub-basins, extracting dominant soil taxonomy (Inceptisols, Vertisols, Alfisols, Aridisols) and baseline horizons (θ_fc, θ_wp, θ_sat).</w:t>
+      </w:r>
+    </w:p>
+    <w:p>
+      <w:pPr>
+        <w:spacing w:before="0" w:after="40" w:line="252" w:lineRule="auto"/>
+        <w:ind w:left="259" w:hanging="173"/>
+        <w:jc w:val="both"/>
+      </w:pPr>
+      <w:r>
+        <w:rPr>
+          <w:rFonts w:ascii="Times New Roman" w:hAnsi="Times New Roman"/>
+          <w:sz w:val="19"/>
+        </w:rPr>
+        <w:t>• Atmospheric Ingestion: Live REST queries to Open-Meteo yield real-time T, RH, R_s, u₂, and precipitation P.</w:t>
+      </w:r>
+    </w:p>
+    <w:p>
+      <w:pPr>
+        <w:spacing w:before="0" w:after="40" w:line="252" w:lineRule="auto"/>
+        <w:ind w:left="259" w:hanging="173"/>
+        <w:jc w:val="both"/>
+      </w:pPr>
+      <w:r>
+        <w:rPr>
+          <w:rFonts w:ascii="Times New Roman" w:hAnsi="Times New Roman"/>
+          <w:sz w:val="19"/>
+        </w:rPr>
+        <w:t>• Cascaded Execution: The five fuzzy engines compute sequentially within an average execution latency of 18.2 ms.</w:t>
+      </w:r>
+    </w:p>
+    <w:p>
+      <w:pPr>
+        <w:spacing w:before="0" w:after="40" w:line="252" w:lineRule="auto"/>
+        <w:ind w:left="259" w:hanging="173"/>
+        <w:jc w:val="both"/>
+      </w:pPr>
+      <w:r>
+        <w:rPr>
+          <w:rFonts w:ascii="Times New Roman" w:hAnsi="Times New Roman"/>
+          <w:sz w:val="19"/>
+        </w:rPr>
+        <w:t>• Actuator Manifold Modulation: The resulting aperture U_final is converted into Solenoid Pulse Width Modulation (PWM) duty cycles and orifice discharge flow rates: Q_i = C_d A_orifice √(2 ΔP / ρ_w) [L·min⁻¹].</w:t>
       </w:r>
     </w:p>
     <w:p>
       <w:pPr>
         <w:keepNext/>
-        <w:spacing w:before="280" w:after="120"/>
+        <w:spacing w:before="200" w:after="80"/>
         <w:jc w:val="center"/>
       </w:pPr>
       <w:r>
@@ -1337,7 +1837,8 @@
     </w:p>
     <w:p>
       <w:pPr>
-        <w:spacing w:before="0" w:after="120" w:line="276" w:lineRule="auto"/>
+        <w:spacing w:before="0" w:after="80" w:line="252" w:lineRule="auto"/>
+        <w:ind w:firstLine="202"/>
         <w:jc w:val="both"/>
       </w:pPr>
       <w:r>
@@ -1357,37 +1858,43 @@
     <w:p>
       <w:pPr>
         <w:keepNext/>
+        <w:spacing w:before="120" w:after="40"/>
         <w:jc w:val="center"/>
       </w:pPr>
       <w:r>
         <w:rPr>
           <w:b/>
-          <w:sz w:val="17"/>
+          <w:sz w:val="16"/>
         </w:rPr>
         <w:t>TABLE II</w:t>
         <w:br/>
-        <w:t>PERFORMANCE BENCHMARKS ACROSS 96-HOUR CONTINUOUS AGRICULTURAL SIMULATION</w:t>
+        <w:t>96-HOUR CONTINUOUS SIMULATION BENCHMARK</w:t>
       </w:r>
     </w:p>
     <w:tbl>
       <w:tblPr>
         <w:tblW w:type="auto" w:w="0"/>
         <w:jc w:val="center"/>
+        <w:tblLayout w:type="fixed"/>
         <w:tblLook w:firstColumn="1" w:firstRow="1" w:lastColumn="0" w:lastRow="0" w:noHBand="0" w:noVBand="1" w:val="04A0"/>
       </w:tblPr>
       <w:tblGrid>
-        <w:gridCol w:w="1704"/>
-        <w:gridCol w:w="1704"/>
-        <w:gridCol w:w="1704"/>
-        <w:gridCol w:w="1704"/>
-        <w:gridCol w:w="1704"/>
-        <w:gridCol w:w="1704"/>
+        <w:gridCol w:w="2610"/>
+        <w:gridCol w:w="2610"/>
+        <w:gridCol w:w="2610"/>
+        <w:gridCol w:w="2610"/>
       </w:tblGrid>
       <w:tr>
         <w:tc>
           <w:tcPr>
-            <w:tcW w:type="dxa" w:w="1704"/>
+            <w:tcW w:type="dxa" w:w="1800"/>
             <w:shd w:fill="E2E8F0"/>
+            <w:tcMar>
+              <w:top w:w="30" w:type="dxa"/>
+              <w:bottom w:w="30" w:type="dxa"/>
+              <w:left w:w="30" w:type="dxa"/>
+              <w:right w:w="30" w:type="dxa"/>
+            </w:tcMar>
           </w:tcPr>
           <w:p>
             <w:pPr>
@@ -1396,16 +1903,22 @@
             <w:r>
               <w:rPr>
                 <w:b/>
-                <w:sz w:val="16"/>
+                <w:sz w:val="14"/>
               </w:rPr>
-              <w:t>Evaluation Metric</w:t>
+              <w:t>Metric</w:t>
             </w:r>
           </w:p>
         </w:tc>
         <w:tc>
           <w:tcPr>
-            <w:tcW w:type="dxa" w:w="1704"/>
+            <w:tcW w:type="dxa" w:w="1080"/>
             <w:shd w:fill="E2E8F0"/>
+            <w:tcMar>
+              <w:top w:w="30" w:type="dxa"/>
+              <w:bottom w:w="30" w:type="dxa"/>
+              <w:left w:w="30" w:type="dxa"/>
+              <w:right w:w="30" w:type="dxa"/>
+            </w:tcMar>
           </w:tcPr>
           <w:p>
             <w:pPr>
@@ -1414,16 +1927,22 @@
             <w:r>
               <w:rPr>
                 <w:b/>
-                <w:sz w:val="16"/>
+                <w:sz w:val="14"/>
               </w:rPr>
-              <w:t>On-Off Controller</w:t>
+              <w:t>On-Off</w:t>
             </w:r>
           </w:p>
         </w:tc>
         <w:tc>
           <w:tcPr>
-            <w:tcW w:type="dxa" w:w="1704"/>
+            <w:tcW w:type="dxa" w:w="1080"/>
             <w:shd w:fill="E2E8F0"/>
+            <w:tcMar>
+              <w:top w:w="30" w:type="dxa"/>
+              <w:bottom w:w="30" w:type="dxa"/>
+              <w:left w:w="30" w:type="dxa"/>
+              <w:right w:w="30" w:type="dxa"/>
+            </w:tcMar>
           </w:tcPr>
           <w:p>
             <w:pPr>
@@ -1432,16 +1951,22 @@
             <w:r>
               <w:rPr>
                 <w:b/>
-                <w:sz w:val="16"/>
+                <w:sz w:val="14"/>
               </w:rPr>
-              <w:t>Tuned PID</w:t>
+              <w:t>PID</w:t>
             </w:r>
           </w:p>
         </w:tc>
         <w:tc>
           <w:tcPr>
-            <w:tcW w:type="dxa" w:w="1704"/>
+            <w:tcW w:type="dxa" w:w="1080"/>
             <w:shd w:fill="E2E8F0"/>
+            <w:tcMar>
+              <w:top w:w="30" w:type="dxa"/>
+              <w:bottom w:w="30" w:type="dxa"/>
+              <w:left w:w="30" w:type="dxa"/>
+              <w:right w:w="30" w:type="dxa"/>
+            </w:tcMar>
           </w:tcPr>
           <w:p>
             <w:pPr>
@@ -1450,16 +1975,86 @@
             <w:r>
               <w:rPr>
                 <w:b/>
-                <w:sz w:val="16"/>
+                <w:sz w:val="14"/>
               </w:rPr>
-              <w:t>Proposed HAFC</w:t>
+              <w:t>HAFC (Ours)</w:t>
+            </w:r>
+          </w:p>
+        </w:tc>
+      </w:tr>
+      <w:tr>
+        <w:tc>
+          <w:tcPr>
+            <w:tcW w:type="dxa" w:w="1800"/>
+            <w:tcMar>
+              <w:top w:w="25" w:type="dxa"/>
+              <w:bottom w:w="25" w:type="dxa"/>
+              <w:left w:w="25" w:type="dxa"/>
+              <w:right w:w="25" w:type="dxa"/>
+            </w:tcMar>
+          </w:tcPr>
+          <w:p>
+            <w:r>
+              <w:rPr>
+                <w:sz w:val="14"/>
+              </w:rPr>
+              <w:t>Water Used (L)</w:t>
             </w:r>
           </w:p>
         </w:tc>
         <w:tc>
           <w:tcPr>
-            <w:tcW w:type="dxa" w:w="1704"/>
-            <w:shd w:fill="E2E8F0"/>
+            <w:tcW w:type="dxa" w:w="1080"/>
+            <w:tcMar>
+              <w:top w:w="25" w:type="dxa"/>
+              <w:bottom w:w="25" w:type="dxa"/>
+              <w:left w:w="25" w:type="dxa"/>
+              <w:right w:w="25" w:type="dxa"/>
+            </w:tcMar>
+          </w:tcPr>
+          <w:p>
+            <w:pPr>
+              <w:jc w:val="center"/>
+            </w:pPr>
+            <w:r>
+              <w:rPr>
+                <w:sz w:val="14"/>
+              </w:rPr>
+              <w:t>12,480</w:t>
+            </w:r>
+          </w:p>
+        </w:tc>
+        <w:tc>
+          <w:tcPr>
+            <w:tcW w:type="dxa" w:w="1080"/>
+            <w:tcMar>
+              <w:top w:w="25" w:type="dxa"/>
+              <w:bottom w:w="25" w:type="dxa"/>
+              <w:left w:w="25" w:type="dxa"/>
+              <w:right w:w="25" w:type="dxa"/>
+            </w:tcMar>
+          </w:tcPr>
+          <w:p>
+            <w:pPr>
+              <w:jc w:val="center"/>
+            </w:pPr>
+            <w:r>
+              <w:rPr>
+                <w:sz w:val="14"/>
+              </w:rPr>
+              <w:t>7,160</w:t>
+            </w:r>
+          </w:p>
+        </w:tc>
+        <w:tc>
+          <w:tcPr>
+            <w:tcW w:type="dxa" w:w="1080"/>
+            <w:tcMar>
+              <w:top w:w="25" w:type="dxa"/>
+              <w:bottom w:w="25" w:type="dxa"/>
+              <w:left w:w="25" w:type="dxa"/>
+              <w:right w:w="25" w:type="dxa"/>
+            </w:tcMar>
           </w:tcPr>
           <w:p>
             <w:pPr>
@@ -1468,16 +2063,86 @@
             <w:r>
               <w:rPr>
                 <w:b/>
-                <w:sz w:val="16"/>
+                <w:sz w:val="14"/>
               </w:rPr>
-              <w:t>Gain vs. On-Off</w:t>
+              <w:t>6,275 (-49.7%)</w:t>
+            </w:r>
+          </w:p>
+        </w:tc>
+      </w:tr>
+      <w:tr>
+        <w:tc>
+          <w:tcPr>
+            <w:tcW w:type="dxa" w:w="1800"/>
+            <w:tcMar>
+              <w:top w:w="25" w:type="dxa"/>
+              <w:bottom w:w="25" w:type="dxa"/>
+              <w:left w:w="25" w:type="dxa"/>
+              <w:right w:w="25" w:type="dxa"/>
+            </w:tcMar>
+          </w:tcPr>
+          <w:p>
+            <w:r>
+              <w:rPr>
+                <w:sz w:val="14"/>
+              </w:rPr>
+              <w:t>Moisture RMSE</w:t>
             </w:r>
           </w:p>
         </w:tc>
         <w:tc>
           <w:tcPr>
-            <w:tcW w:type="dxa" w:w="1704"/>
-            <w:shd w:fill="E2E8F0"/>
+            <w:tcW w:type="dxa" w:w="1080"/>
+            <w:tcMar>
+              <w:top w:w="25" w:type="dxa"/>
+              <w:bottom w:w="25" w:type="dxa"/>
+              <w:left w:w="25" w:type="dxa"/>
+              <w:right w:w="25" w:type="dxa"/>
+            </w:tcMar>
+          </w:tcPr>
+          <w:p>
+            <w:pPr>
+              <w:jc w:val="center"/>
+            </w:pPr>
+            <w:r>
+              <w:rPr>
+                <w:sz w:val="14"/>
+              </w:rPr>
+              <w:t>5.62%</w:t>
+            </w:r>
+          </w:p>
+        </w:tc>
+        <w:tc>
+          <w:tcPr>
+            <w:tcW w:type="dxa" w:w="1080"/>
+            <w:tcMar>
+              <w:top w:w="25" w:type="dxa"/>
+              <w:bottom w:w="25" w:type="dxa"/>
+              <w:left w:w="25" w:type="dxa"/>
+              <w:right w:w="25" w:type="dxa"/>
+            </w:tcMar>
+          </w:tcPr>
+          <w:p>
+            <w:pPr>
+              <w:jc w:val="center"/>
+            </w:pPr>
+            <w:r>
+              <w:rPr>
+                <w:sz w:val="14"/>
+              </w:rPr>
+              <w:t>1.85%</w:t>
+            </w:r>
+          </w:p>
+        </w:tc>
+        <w:tc>
+          <w:tcPr>
+            <w:tcW w:type="dxa" w:w="1080"/>
+            <w:tcMar>
+              <w:top w:w="25" w:type="dxa"/>
+              <w:bottom w:w="25" w:type="dxa"/>
+              <w:left w:w="25" w:type="dxa"/>
+              <w:right w:w="25" w:type="dxa"/>
+            </w:tcMar>
           </w:tcPr>
           <w:p>
             <w:pPr>
@@ -1486,9 +2151,9 @@
             <w:r>
               <w:rPr>
                 <w:b/>
-                <w:sz w:val="16"/>
+                <w:sz w:val="14"/>
               </w:rPr>
-              <w:t>Gain vs. PID</w:t>
+              <w:t>0.42% (-77%)</w:t>
             </w:r>
           </w:p>
         </w:tc>
@@ -1496,20 +2161,32 @@
       <w:tr>
         <w:tc>
           <w:tcPr>
-            <w:tcW w:type="dxa" w:w="1704"/>
+            <w:tcW w:type="dxa" w:w="1800"/>
+            <w:tcMar>
+              <w:top w:w="25" w:type="dxa"/>
+              <w:bottom w:w="25" w:type="dxa"/>
+              <w:left w:w="25" w:type="dxa"/>
+              <w:right w:w="25" w:type="dxa"/>
+            </w:tcMar>
           </w:tcPr>
           <w:p>
             <w:r>
               <w:rPr>
-                <w:sz w:val="16"/>
+                <w:sz w:val="14"/>
               </w:rPr>
-              <w:t>Total Water Consumed (L)</w:t>
+              <w:t>Peak Overshoot</w:t>
             </w:r>
           </w:p>
         </w:tc>
         <w:tc>
           <w:tcPr>
-            <w:tcW w:type="dxa" w:w="1704"/>
+            <w:tcW w:type="dxa" w:w="1080"/>
+            <w:tcMar>
+              <w:top w:w="25" w:type="dxa"/>
+              <w:bottom w:w="25" w:type="dxa"/>
+              <w:left w:w="25" w:type="dxa"/>
+              <w:right w:w="25" w:type="dxa"/>
+            </w:tcMar>
           </w:tcPr>
           <w:p>
             <w:pPr>
@@ -1517,15 +2194,21 @@
             </w:pPr>
             <w:r>
               <w:rPr>
-                <w:sz w:val="16"/>
+                <w:sz w:val="14"/>
               </w:rPr>
-              <w:t>12,480.0 L</w:t>
+              <w:t>+8.4%</w:t>
             </w:r>
           </w:p>
         </w:tc>
         <w:tc>
           <w:tcPr>
-            <w:tcW w:type="dxa" w:w="1704"/>
+            <w:tcW w:type="dxa" w:w="1080"/>
+            <w:tcMar>
+              <w:top w:w="25" w:type="dxa"/>
+              <w:bottom w:w="25" w:type="dxa"/>
+              <w:left w:w="25" w:type="dxa"/>
+              <w:right w:w="25" w:type="dxa"/>
+            </w:tcMar>
           </w:tcPr>
           <w:p>
             <w:pPr>
@@ -1533,15 +2216,21 @@
             </w:pPr>
             <w:r>
               <w:rPr>
-                <w:sz w:val="16"/>
+                <w:sz w:val="14"/>
               </w:rPr>
-              <w:t>7,160.4 L</w:t>
+              <w:t>+3.2%</w:t>
             </w:r>
           </w:p>
         </w:tc>
         <w:tc>
           <w:tcPr>
-            <w:tcW w:type="dxa" w:w="1704"/>
+            <w:tcW w:type="dxa" w:w="1080"/>
+            <w:tcMar>
+              <w:top w:w="25" w:type="dxa"/>
+              <w:bottom w:w="25" w:type="dxa"/>
+              <w:left w:w="25" w:type="dxa"/>
+              <w:right w:w="25" w:type="dxa"/>
+            </w:tcMar>
           </w:tcPr>
           <w:p>
             <w:pPr>
@@ -1550,15 +2239,42 @@
             <w:r>
               <w:rPr>
                 <w:b/>
-                <w:sz w:val="16"/>
+                <w:sz w:val="14"/>
               </w:rPr>
-              <w:t>6,275.2 L</w:t>
+              <w:t>+0.4%</w:t>
+            </w:r>
+          </w:p>
+        </w:tc>
+      </w:tr>
+      <w:tr>
+        <w:tc>
+          <w:tcPr>
+            <w:tcW w:type="dxa" w:w="1800"/>
+            <w:tcMar>
+              <w:top w:w="25" w:type="dxa"/>
+              <w:bottom w:w="25" w:type="dxa"/>
+              <w:left w:w="25" w:type="dxa"/>
+              <w:right w:w="25" w:type="dxa"/>
+            </w:tcMar>
+          </w:tcPr>
+          <w:p>
+            <w:r>
+              <w:rPr>
+                <w:sz w:val="14"/>
+              </w:rPr>
+              <w:t>WP Undershoot</w:t>
             </w:r>
           </w:p>
         </w:tc>
         <w:tc>
           <w:tcPr>
-            <w:tcW w:type="dxa" w:w="1704"/>
+            <w:tcW w:type="dxa" w:w="1080"/>
+            <w:tcMar>
+              <w:top w:w="25" w:type="dxa"/>
+              <w:bottom w:w="25" w:type="dxa"/>
+              <w:left w:w="25" w:type="dxa"/>
+              <w:right w:w="25" w:type="dxa"/>
+            </w:tcMar>
           </w:tcPr>
           <w:p>
             <w:pPr>
@@ -1566,15 +2282,21 @@
             </w:pPr>
             <w:r>
               <w:rPr>
-                <w:sz w:val="16"/>
+                <w:sz w:val="14"/>
               </w:rPr>
-              <w:t>+49.72%</w:t>
+              <w:t>-4.8%</w:t>
             </w:r>
           </w:p>
         </w:tc>
         <w:tc>
           <w:tcPr>
-            <w:tcW w:type="dxa" w:w="1704"/>
+            <w:tcW w:type="dxa" w:w="1080"/>
+            <w:tcMar>
+              <w:top w:w="25" w:type="dxa"/>
+              <w:bottom w:w="25" w:type="dxa"/>
+              <w:left w:w="25" w:type="dxa"/>
+              <w:right w:w="25" w:type="dxa"/>
+            </w:tcMar>
           </w:tcPr>
           <w:p>
             <w:pPr>
@@ -1582,62 +2304,21 @@
             </w:pPr>
             <w:r>
               <w:rPr>
-                <w:sz w:val="16"/>
+                <w:sz w:val="14"/>
               </w:rPr>
-              <w:t>+12.36%</w:t>
-            </w:r>
-          </w:p>
-        </w:tc>
-      </w:tr>
-      <w:tr>
-        <w:tc>
-          <w:tcPr>
-            <w:tcW w:type="dxa" w:w="1704"/>
-          </w:tcPr>
-          <w:p>
-            <w:r>
-              <w:rPr>
-                <w:sz w:val="16"/>
-              </w:rPr>
-              <w:t>Moisture Tracking RMSE (%)</w:t>
+              <w:t>-1.6%</w:t>
             </w:r>
           </w:p>
         </w:tc>
         <w:tc>
           <w:tcPr>
-            <w:tcW w:type="dxa" w:w="1704"/>
-          </w:tcPr>
-          <w:p>
-            <w:pPr>
-              <w:jc w:val="center"/>
-            </w:pPr>
-            <w:r>
-              <w:rPr>
-                <w:sz w:val="16"/>
-              </w:rPr>
-              <w:t>5.62%</w:t>
-            </w:r>
-          </w:p>
-        </w:tc>
-        <w:tc>
-          <w:tcPr>
-            <w:tcW w:type="dxa" w:w="1704"/>
-          </w:tcPr>
-          <w:p>
-            <w:pPr>
-              <w:jc w:val="center"/>
-            </w:pPr>
-            <w:r>
-              <w:rPr>
-                <w:sz w:val="16"/>
-              </w:rPr>
-              <w:t>1.85%</w:t>
-            </w:r>
-          </w:p>
-        </w:tc>
-        <w:tc>
-          <w:tcPr>
-            <w:tcW w:type="dxa" w:w="1704"/>
+            <w:tcW w:type="dxa" w:w="1080"/>
+            <w:tcMar>
+              <w:top w:w="25" w:type="dxa"/>
+              <w:bottom w:w="25" w:type="dxa"/>
+              <w:left w:w="25" w:type="dxa"/>
+              <w:right w:w="25" w:type="dxa"/>
+            </w:tcMar>
           </w:tcPr>
           <w:p>
             <w:pPr>
@@ -1646,15 +2327,42 @@
             <w:r>
               <w:rPr>
                 <w:b/>
-                <w:sz w:val="16"/>
+                <w:sz w:val="14"/>
               </w:rPr>
-              <w:t>0.42%</w:t>
+              <w:t>0.0% (Elim.)</w:t>
+            </w:r>
+          </w:p>
+        </w:tc>
+      </w:tr>
+      <w:tr>
+        <w:tc>
+          <w:tcPr>
+            <w:tcW w:type="dxa" w:w="1800"/>
+            <w:tcMar>
+              <w:top w:w="25" w:type="dxa"/>
+              <w:bottom w:w="25" w:type="dxa"/>
+              <w:left w:w="25" w:type="dxa"/>
+              <w:right w:w="25" w:type="dxa"/>
+            </w:tcMar>
+          </w:tcPr>
+          <w:p>
+            <w:r>
+              <w:rPr>
+                <w:sz w:val="14"/>
+              </w:rPr>
+              <w:t>Stress Days</w:t>
             </w:r>
           </w:p>
         </w:tc>
         <w:tc>
           <w:tcPr>
-            <w:tcW w:type="dxa" w:w="1704"/>
+            <w:tcW w:type="dxa" w:w="1080"/>
+            <w:tcMar>
+              <w:top w:w="25" w:type="dxa"/>
+              <w:bottom w:w="25" w:type="dxa"/>
+              <w:left w:w="25" w:type="dxa"/>
+              <w:right w:w="25" w:type="dxa"/>
+            </w:tcMar>
           </w:tcPr>
           <w:p>
             <w:pPr>
@@ -1662,15 +2370,21 @@
             </w:pPr>
             <w:r>
               <w:rPr>
-                <w:sz w:val="16"/>
+                <w:sz w:val="14"/>
               </w:rPr>
-              <w:t>-92.53%</w:t>
+              <w:t>2.4 d</w:t>
             </w:r>
           </w:p>
         </w:tc>
         <w:tc>
           <w:tcPr>
-            <w:tcW w:type="dxa" w:w="1704"/>
+            <w:tcW w:type="dxa" w:w="1080"/>
+            <w:tcMar>
+              <w:top w:w="25" w:type="dxa"/>
+              <w:bottom w:w="25" w:type="dxa"/>
+              <w:left w:w="25" w:type="dxa"/>
+              <w:right w:w="25" w:type="dxa"/>
+            </w:tcMar>
           </w:tcPr>
           <w:p>
             <w:pPr>
@@ -1678,62 +2392,21 @@
             </w:pPr>
             <w:r>
               <w:rPr>
-                <w:sz w:val="16"/>
+                <w:sz w:val="14"/>
               </w:rPr>
-              <w:t>-77.30%</w:t>
-            </w:r>
-          </w:p>
-        </w:tc>
-      </w:tr>
-      <w:tr>
-        <w:tc>
-          <w:tcPr>
-            <w:tcW w:type="dxa" w:w="1704"/>
-          </w:tcPr>
-          <w:p>
-            <w:r>
-              <w:rPr>
-                <w:sz w:val="16"/>
-              </w:rPr>
-              <w:t>Peak Moisture Overshoot (%)</w:t>
+              <w:t>0.8 d</w:t>
             </w:r>
           </w:p>
         </w:tc>
         <w:tc>
           <w:tcPr>
-            <w:tcW w:type="dxa" w:w="1704"/>
-          </w:tcPr>
-          <w:p>
-            <w:pPr>
-              <w:jc w:val="center"/>
-            </w:pPr>
-            <w:r>
-              <w:rPr>
-                <w:sz w:val="16"/>
-              </w:rPr>
-              <w:t>+8.4%</w:t>
-            </w:r>
-          </w:p>
-        </w:tc>
-        <w:tc>
-          <w:tcPr>
-            <w:tcW w:type="dxa" w:w="1704"/>
-          </w:tcPr>
-          <w:p>
-            <w:pPr>
-              <w:jc w:val="center"/>
-            </w:pPr>
-            <w:r>
-              <w:rPr>
-                <w:sz w:val="16"/>
-              </w:rPr>
-              <w:t>+3.2%</w:t>
-            </w:r>
-          </w:p>
-        </w:tc>
-        <w:tc>
-          <w:tcPr>
-            <w:tcW w:type="dxa" w:w="1704"/>
+            <w:tcW w:type="dxa" w:w="1080"/>
+            <w:tcMar>
+              <w:top w:w="25" w:type="dxa"/>
+              <w:bottom w:w="25" w:type="dxa"/>
+              <w:left w:w="25" w:type="dxa"/>
+              <w:right w:w="25" w:type="dxa"/>
+            </w:tcMar>
           </w:tcPr>
           <w:p>
             <w:pPr>
@@ -1742,15 +2415,42 @@
             <w:r>
               <w:rPr>
                 <w:b/>
-                <w:sz w:val="16"/>
+                <w:sz w:val="14"/>
               </w:rPr>
-              <w:t>+0.4%</w:t>
+              <w:t>0.0 d (Elim.)</w:t>
+            </w:r>
+          </w:p>
+        </w:tc>
+      </w:tr>
+      <w:tr>
+        <w:tc>
+          <w:tcPr>
+            <w:tcW w:type="dxa" w:w="1800"/>
+            <w:tcMar>
+              <w:top w:w="25" w:type="dxa"/>
+              <w:bottom w:w="25" w:type="dxa"/>
+              <w:left w:w="25" w:type="dxa"/>
+              <w:right w:w="25" w:type="dxa"/>
+            </w:tcMar>
+          </w:tcPr>
+          <w:p>
+            <w:r>
+              <w:rPr>
+                <w:sz w:val="14"/>
+              </w:rPr>
+              <w:t>Energy (kWh)</w:t>
             </w:r>
           </w:p>
         </w:tc>
         <w:tc>
           <w:tcPr>
-            <w:tcW w:type="dxa" w:w="1704"/>
+            <w:tcW w:type="dxa" w:w="1080"/>
+            <w:tcMar>
+              <w:top w:w="25" w:type="dxa"/>
+              <w:bottom w:w="25" w:type="dxa"/>
+              <w:left w:w="25" w:type="dxa"/>
+              <w:right w:w="25" w:type="dxa"/>
+            </w:tcMar>
           </w:tcPr>
           <w:p>
             <w:pPr>
@@ -1758,15 +2458,21 @@
             </w:pPr>
             <w:r>
               <w:rPr>
-                <w:sz w:val="16"/>
+                <w:sz w:val="14"/>
               </w:rPr>
-              <w:t>-95.24%</w:t>
+              <w:t>18.42</w:t>
             </w:r>
           </w:p>
         </w:tc>
         <w:tc>
           <w:tcPr>
-            <w:tcW w:type="dxa" w:w="1704"/>
+            <w:tcW w:type="dxa" w:w="1080"/>
+            <w:tcMar>
+              <w:top w:w="25" w:type="dxa"/>
+              <w:bottom w:w="25" w:type="dxa"/>
+              <w:left w:w="25" w:type="dxa"/>
+              <w:right w:w="25" w:type="dxa"/>
+            </w:tcMar>
           </w:tcPr>
           <w:p>
             <w:pPr>
@@ -1774,62 +2480,21 @@
             </w:pPr>
             <w:r>
               <w:rPr>
-                <w:sz w:val="16"/>
+                <w:sz w:val="14"/>
               </w:rPr>
-              <w:t>-87.50%</w:t>
-            </w:r>
-          </w:p>
-        </w:tc>
-      </w:tr>
-      <w:tr>
-        <w:tc>
-          <w:tcPr>
-            <w:tcW w:type="dxa" w:w="1704"/>
-          </w:tcPr>
-          <w:p>
-            <w:r>
-              <w:rPr>
-                <w:sz w:val="16"/>
-              </w:rPr>
-              <w:t>Undershoot Below Wilting Point</w:t>
+              <w:t>11.20</w:t>
             </w:r>
           </w:p>
         </w:tc>
         <w:tc>
           <w:tcPr>
-            <w:tcW w:type="dxa" w:w="1704"/>
-          </w:tcPr>
-          <w:p>
-            <w:pPr>
-              <w:jc w:val="center"/>
-            </w:pPr>
-            <w:r>
-              <w:rPr>
-                <w:sz w:val="16"/>
-              </w:rPr>
-              <w:t>-4.8%</w:t>
-            </w:r>
-          </w:p>
-        </w:tc>
-        <w:tc>
-          <w:tcPr>
-            <w:tcW w:type="dxa" w:w="1704"/>
-          </w:tcPr>
-          <w:p>
-            <w:pPr>
-              <w:jc w:val="center"/>
-            </w:pPr>
-            <w:r>
-              <w:rPr>
-                <w:sz w:val="16"/>
-              </w:rPr>
-              <w:t>-1.6%</w:t>
-            </w:r>
-          </w:p>
-        </w:tc>
-        <w:tc>
-          <w:tcPr>
-            <w:tcW w:type="dxa" w:w="1704"/>
+            <w:tcW w:type="dxa" w:w="1080"/>
+            <w:tcMar>
+              <w:top w:w="25" w:type="dxa"/>
+              <w:bottom w:w="25" w:type="dxa"/>
+              <w:left w:w="25" w:type="dxa"/>
+              <w:right w:w="25" w:type="dxa"/>
+            </w:tcMar>
           </w:tcPr>
           <w:p>
             <w:pPr>
@@ -1838,15 +2503,42 @@
             <w:r>
               <w:rPr>
                 <w:b/>
-                <w:sz w:val="16"/>
+                <w:sz w:val="14"/>
               </w:rPr>
-              <w:t>0.0%</w:t>
+              <w:t>8.94 (-51.5%)</w:t>
+            </w:r>
+          </w:p>
+        </w:tc>
+      </w:tr>
+      <w:tr>
+        <w:tc>
+          <w:tcPr>
+            <w:tcW w:type="dxa" w:w="1800"/>
+            <w:tcMar>
+              <w:top w:w="25" w:type="dxa"/>
+              <w:bottom w:w="25" w:type="dxa"/>
+              <w:left w:w="25" w:type="dxa"/>
+              <w:right w:w="25" w:type="dxa"/>
+            </w:tcMar>
+          </w:tcPr>
+          <w:p>
+            <w:r>
+              <w:rPr>
+                <w:sz w:val="14"/>
+              </w:rPr>
+              <w:t>Rain Wasted</w:t>
             </w:r>
           </w:p>
         </w:tc>
         <w:tc>
           <w:tcPr>
-            <w:tcW w:type="dxa" w:w="1704"/>
+            <w:tcW w:type="dxa" w:w="1080"/>
+            <w:tcMar>
+              <w:top w:w="25" w:type="dxa"/>
+              <w:bottom w:w="25" w:type="dxa"/>
+              <w:left w:w="25" w:type="dxa"/>
+              <w:right w:w="25" w:type="dxa"/>
+            </w:tcMar>
           </w:tcPr>
           <w:p>
             <w:pPr>
@@ -1854,15 +2546,21 @@
             </w:pPr>
             <w:r>
               <w:rPr>
-                <w:sz w:val="16"/>
+                <w:sz w:val="14"/>
               </w:rPr>
-              <w:t>100% Elim.</w:t>
+              <w:t>1,840 L</w:t>
             </w:r>
           </w:p>
         </w:tc>
         <w:tc>
           <w:tcPr>
-            <w:tcW w:type="dxa" w:w="1704"/>
+            <w:tcW w:type="dxa" w:w="1080"/>
+            <w:tcMar>
+              <w:top w:w="25" w:type="dxa"/>
+              <w:bottom w:w="25" w:type="dxa"/>
+              <w:left w:w="25" w:type="dxa"/>
+              <w:right w:w="25" w:type="dxa"/>
+            </w:tcMar>
           </w:tcPr>
           <w:p>
             <w:pPr>
@@ -1870,62 +2568,21 @@
             </w:pPr>
             <w:r>
               <w:rPr>
-                <w:sz w:val="16"/>
+                <w:sz w:val="14"/>
               </w:rPr>
-              <w:t>100% Elim.</w:t>
-            </w:r>
-          </w:p>
-        </w:tc>
-      </w:tr>
-      <w:tr>
-        <w:tc>
-          <w:tcPr>
-            <w:tcW w:type="dxa" w:w="1704"/>
-          </w:tcPr>
-          <w:p>
-            <w:r>
-              <w:rPr>
-                <w:sz w:val="16"/>
-              </w:rPr>
-              <w:t>Cumulative Crop Stress Days</w:t>
+              <w:t>620 L</w:t>
             </w:r>
           </w:p>
         </w:tc>
         <w:tc>
           <w:tcPr>
-            <w:tcW w:type="dxa" w:w="1704"/>
-          </w:tcPr>
-          <w:p>
-            <w:pPr>
-              <w:jc w:val="center"/>
-            </w:pPr>
-            <w:r>
-              <w:rPr>
-                <w:sz w:val="16"/>
-              </w:rPr>
-              <w:t>2.4 Days</w:t>
-            </w:r>
-          </w:p>
-        </w:tc>
-        <w:tc>
-          <w:tcPr>
-            <w:tcW w:type="dxa" w:w="1704"/>
-          </w:tcPr>
-          <w:p>
-            <w:pPr>
-              <w:jc w:val="center"/>
-            </w:pPr>
-            <w:r>
-              <w:rPr>
-                <w:sz w:val="16"/>
-              </w:rPr>
-              <w:t>0.8 Days</w:t>
-            </w:r>
-          </w:p>
-        </w:tc>
-        <w:tc>
-          <w:tcPr>
-            <w:tcW w:type="dxa" w:w="1704"/>
+            <w:tcW w:type="dxa" w:w="1080"/>
+            <w:tcMar>
+              <w:top w:w="25" w:type="dxa"/>
+              <w:bottom w:w="25" w:type="dxa"/>
+              <w:left w:w="25" w:type="dxa"/>
+              <w:right w:w="25" w:type="dxa"/>
+            </w:tcMar>
           </w:tcPr>
           <w:p>
             <w:pPr>
@@ -1934,15 +2591,42 @@
             <w:r>
               <w:rPr>
                 <w:b/>
-                <w:sz w:val="16"/>
+                <w:sz w:val="14"/>
               </w:rPr>
-              <w:t>0.0 Days</w:t>
+              <w:t>0 L (100% saved)</w:t>
+            </w:r>
+          </w:p>
+        </w:tc>
+      </w:tr>
+      <w:tr>
+        <w:tc>
+          <w:tcPr>
+            <w:tcW w:type="dxa" w:w="1800"/>
+            <w:tcMar>
+              <w:top w:w="25" w:type="dxa"/>
+              <w:bottom w:w="25" w:type="dxa"/>
+              <w:left w:w="25" w:type="dxa"/>
+              <w:right w:w="25" w:type="dxa"/>
+            </w:tcMar>
+          </w:tcPr>
+          <w:p>
+            <w:r>
+              <w:rPr>
+                <w:sz w:val="14"/>
+              </w:rPr>
+              <w:t>Mass Residual</w:t>
             </w:r>
           </w:p>
         </w:tc>
         <w:tc>
           <w:tcPr>
-            <w:tcW w:type="dxa" w:w="1704"/>
+            <w:tcW w:type="dxa" w:w="1080"/>
+            <w:tcMar>
+              <w:top w:w="25" w:type="dxa"/>
+              <w:bottom w:w="25" w:type="dxa"/>
+              <w:left w:w="25" w:type="dxa"/>
+              <w:right w:w="25" w:type="dxa"/>
+            </w:tcMar>
           </w:tcPr>
           <w:p>
             <w:pPr>
@@ -1950,15 +2634,21 @@
             </w:pPr>
             <w:r>
               <w:rPr>
-                <w:sz w:val="16"/>
+                <w:sz w:val="14"/>
               </w:rPr>
-              <w:t>100% Elim.</w:t>
+              <w:t>N/A</w:t>
             </w:r>
           </w:p>
         </w:tc>
         <w:tc>
           <w:tcPr>
-            <w:tcW w:type="dxa" w:w="1704"/>
+            <w:tcW w:type="dxa" w:w="1080"/>
+            <w:tcMar>
+              <w:top w:w="25" w:type="dxa"/>
+              <w:bottom w:w="25" w:type="dxa"/>
+              <w:left w:w="25" w:type="dxa"/>
+              <w:right w:w="25" w:type="dxa"/>
+            </w:tcMar>
           </w:tcPr>
           <w:p>
             <w:pPr>
@@ -1966,62 +2656,21 @@
             </w:pPr>
             <w:r>
               <w:rPr>
-                <w:sz w:val="16"/>
+                <w:sz w:val="14"/>
               </w:rPr>
-              <w:t>100% Elim.</w:t>
-            </w:r>
-          </w:p>
-        </w:tc>
-      </w:tr>
-      <w:tr>
-        <w:tc>
-          <w:tcPr>
-            <w:tcW w:type="dxa" w:w="1704"/>
-          </w:tcPr>
-          <w:p>
-            <w:r>
-              <w:rPr>
-                <w:sz w:val="16"/>
-              </w:rPr>
-              <w:t>Pumping Energy (kWh)</w:t>
+              <w:t>N/A</w:t>
             </w:r>
           </w:p>
         </w:tc>
         <w:tc>
           <w:tcPr>
-            <w:tcW w:type="dxa" w:w="1704"/>
-          </w:tcPr>
-          <w:p>
-            <w:pPr>
-              <w:jc w:val="center"/>
-            </w:pPr>
-            <w:r>
-              <w:rPr>
-                <w:sz w:val="16"/>
-              </w:rPr>
-              <w:t>18.42 kWh</w:t>
-            </w:r>
-          </w:p>
-        </w:tc>
-        <w:tc>
-          <w:tcPr>
-            <w:tcW w:type="dxa" w:w="1704"/>
-          </w:tcPr>
-          <w:p>
-            <w:pPr>
-              <w:jc w:val="center"/>
-            </w:pPr>
-            <w:r>
-              <w:rPr>
-                <w:sz w:val="16"/>
-              </w:rPr>
-              <w:t>11.20 kWh</w:t>
-            </w:r>
-          </w:p>
-        </w:tc>
-        <w:tc>
-          <w:tcPr>
-            <w:tcW w:type="dxa" w:w="1704"/>
+            <w:tcW w:type="dxa" w:w="1080"/>
+            <w:tcMar>
+              <w:top w:w="25" w:type="dxa"/>
+              <w:bottom w:w="25" w:type="dxa"/>
+              <w:left w:w="25" w:type="dxa"/>
+              <w:right w:w="25" w:type="dxa"/>
+            </w:tcMar>
           </w:tcPr>
           <w:p>
             <w:pPr>
@@ -2030,15 +2679,42 @@
             <w:r>
               <w:rPr>
                 <w:b/>
-                <w:sz w:val="16"/>
+                <w:sz w:val="14"/>
               </w:rPr>
-              <w:t>8.94 kWh</w:t>
+              <w:t>&lt; 10⁻⁶ mm (OK)</w:t>
+            </w:r>
+          </w:p>
+        </w:tc>
+      </w:tr>
+      <w:tr>
+        <w:tc>
+          <w:tcPr>
+            <w:tcW w:type="dxa" w:w="1800"/>
+            <w:tcMar>
+              <w:top w:w="25" w:type="dxa"/>
+              <w:bottom w:w="25" w:type="dxa"/>
+              <w:left w:w="25" w:type="dxa"/>
+              <w:right w:w="25" w:type="dxa"/>
+            </w:tcMar>
+          </w:tcPr>
+          <w:p>
+            <w:r>
+              <w:rPr>
+                <w:sz w:val="14"/>
+              </w:rPr>
+              <w:t>Latency</w:t>
             </w:r>
           </w:p>
         </w:tc>
         <w:tc>
           <w:tcPr>
-            <w:tcW w:type="dxa" w:w="1704"/>
+            <w:tcW w:type="dxa" w:w="1080"/>
+            <w:tcMar>
+              <w:top w:w="25" w:type="dxa"/>
+              <w:bottom w:w="25" w:type="dxa"/>
+              <w:left w:w="25" w:type="dxa"/>
+              <w:right w:w="25" w:type="dxa"/>
+            </w:tcMar>
           </w:tcPr>
           <w:p>
             <w:pPr>
@@ -2046,15 +2722,21 @@
             </w:pPr>
             <w:r>
               <w:rPr>
-                <w:sz w:val="16"/>
+                <w:sz w:val="14"/>
               </w:rPr>
-              <w:t>+51.46%</w:t>
+              <w:t>&lt; 1 ms</w:t>
             </w:r>
           </w:p>
         </w:tc>
         <w:tc>
           <w:tcPr>
-            <w:tcW w:type="dxa" w:w="1704"/>
+            <w:tcW w:type="dxa" w:w="1080"/>
+            <w:tcMar>
+              <w:top w:w="25" w:type="dxa"/>
+              <w:bottom w:w="25" w:type="dxa"/>
+              <w:left w:w="25" w:type="dxa"/>
+              <w:right w:w="25" w:type="dxa"/>
+            </w:tcMar>
           </w:tcPr>
           <w:p>
             <w:pPr>
@@ -2062,62 +2744,21 @@
             </w:pPr>
             <w:r>
               <w:rPr>
-                <w:sz w:val="16"/>
+                <w:sz w:val="14"/>
               </w:rPr>
-              <w:t>+20.18%</w:t>
-            </w:r>
-          </w:p>
-        </w:tc>
-      </w:tr>
-      <w:tr>
-        <w:tc>
-          <w:tcPr>
-            <w:tcW w:type="dxa" w:w="1704"/>
-          </w:tcPr>
-          <w:p>
-            <w:r>
-              <w:rPr>
-                <w:sz w:val="16"/>
-              </w:rPr>
-              <w:t>Rain Infiltration Wastage (L)</w:t>
+              <w:t>&lt; 1 ms</w:t>
             </w:r>
           </w:p>
         </w:tc>
         <w:tc>
           <w:tcPr>
-            <w:tcW w:type="dxa" w:w="1704"/>
-          </w:tcPr>
-          <w:p>
-            <w:pPr>
-              <w:jc w:val="center"/>
-            </w:pPr>
-            <w:r>
-              <w:rPr>
-                <w:sz w:val="16"/>
-              </w:rPr>
-              <w:t>1,840.0 L</w:t>
-            </w:r>
-          </w:p>
-        </w:tc>
-        <w:tc>
-          <w:tcPr>
-            <w:tcW w:type="dxa" w:w="1704"/>
-          </w:tcPr>
-          <w:p>
-            <w:pPr>
-              <w:jc w:val="center"/>
-            </w:pPr>
-            <w:r>
-              <w:rPr>
-                <w:sz w:val="16"/>
-              </w:rPr>
-              <w:t>620.0 L</w:t>
-            </w:r>
-          </w:p>
-        </w:tc>
-        <w:tc>
-          <w:tcPr>
-            <w:tcW w:type="dxa" w:w="1704"/>
+            <w:tcW w:type="dxa" w:w="1080"/>
+            <w:tcMar>
+              <w:top w:w="25" w:type="dxa"/>
+              <w:bottom w:w="25" w:type="dxa"/>
+              <w:left w:w="25" w:type="dxa"/>
+              <w:right w:w="25" w:type="dxa"/>
+            </w:tcMar>
           </w:tcPr>
           <w:p>
             <w:pPr>
@@ -2126,94 +2767,110 @@
             <w:r>
               <w:rPr>
                 <w:b/>
-                <w:sz w:val="16"/>
+                <w:sz w:val="14"/>
               </w:rPr>
-              <w:t>0.0 L</w:t>
-            </w:r>
-          </w:p>
-        </w:tc>
-        <w:tc>
-          <w:tcPr>
-            <w:tcW w:type="dxa" w:w="1704"/>
-          </w:tcPr>
-          <w:p>
-            <w:pPr>
-              <w:jc w:val="center"/>
-            </w:pPr>
-            <w:r>
-              <w:rPr>
-                <w:sz w:val="16"/>
-              </w:rPr>
-              <w:t>100% Saved</w:t>
-            </w:r>
-          </w:p>
-        </w:tc>
-        <w:tc>
-          <w:tcPr>
-            <w:tcW w:type="dxa" w:w="1704"/>
-          </w:tcPr>
-          <w:p>
-            <w:pPr>
-              <w:jc w:val="center"/>
-            </w:pPr>
-            <w:r>
-              <w:rPr>
-                <w:sz w:val="16"/>
-              </w:rPr>
-              <w:t>100% Saved</w:t>
+              <w:t>18.2 ms (Realtime)</w:t>
             </w:r>
           </w:p>
         </w:tc>
       </w:tr>
+    </w:tbl>
+    <w:p>
+      <w:pPr>
+        <w:spacing w:before="0" w:after="80" w:line="252" w:lineRule="auto"/>
+        <w:ind w:firstLine="202"/>
+        <w:jc w:val="both"/>
+      </w:pPr>
+      <w:r>
+        <w:rPr>
+          <w:rFonts w:ascii="Times New Roman" w:hAnsi="Times New Roman"/>
+          <w:sz w:val="20"/>
+        </w:rPr>
+        <w:t>As demonstrated in Table II, HAFC achieves 49.72% water conservation relative to threshold control and 12.36% relative to classical PID feedback. The primary mechanisms driving this efficiency are:</w:t>
+      </w:r>
+    </w:p>
+    <w:p>
+      <w:pPr>
+        <w:spacing w:before="0" w:after="40" w:line="252" w:lineRule="auto"/>
+        <w:ind w:left="259" w:hanging="173"/>
+        <w:jc w:val="both"/>
+      </w:pPr>
+      <w:r>
+        <w:rPr>
+          <w:rFonts w:ascii="Times New Roman" w:hAnsi="Times New Roman"/>
+          <w:sz w:val="19"/>
+        </w:rPr>
+        <w:t>• Elimination of Limit Cycles: Centroid defuzzification provides smooth valve modulation, eliminating drainage leaching caused by hysteresis switches.</w:t>
+      </w:r>
+    </w:p>
+    <w:p>
+      <w:pPr>
+        <w:spacing w:before="0" w:after="40" w:line="252" w:lineRule="auto"/>
+        <w:ind w:left="259" w:hanging="173"/>
+        <w:jc w:val="both"/>
+      </w:pPr>
+      <w:r>
+        <w:rPr>
+          <w:rFonts w:ascii="Times New Roman" w:hAnsi="Times New Roman"/>
+          <w:sz w:val="19"/>
+        </w:rPr>
+        <w:t>• Precipitation Interlock: Layer 2 of the safety kernel immediately zeroes valve commands upon rain onset (P &gt; 5 mm), preventing the application of 1,840 L of wasted water observed in the baseline system.</w:t>
+      </w:r>
+    </w:p>
+    <w:p>
+      <w:pPr>
+        <w:spacing w:before="0" w:after="40" w:line="252" w:lineRule="auto"/>
+        <w:ind w:left="259" w:hanging="173"/>
+        <w:jc w:val="both"/>
+      </w:pPr>
+      <w:r>
+        <w:rPr>
+          <w:rFonts w:ascii="Times New Roman" w:hAnsi="Times New Roman"/>
+          <w:sz w:val="19"/>
+        </w:rPr>
+        <w:t>• Supply-Constrained Scarcity Allocation: Under a severe drought scenario (22% reservoir storage), Stage 5 gracefully preserved 100% survival allocation to high-priority Zone 1 while throttling Zone 3, preventing uniform crop desiccation.</w:t>
+      </w:r>
+    </w:p>
+    <w:p>
+      <w:pPr>
+        <w:keepNext/>
+        <w:spacing w:before="120" w:after="40"/>
+        <w:jc w:val="center"/>
+      </w:pPr>
+      <w:r>
+        <w:rPr>
+          <w:b/>
+          <w:sz w:val="16"/>
+        </w:rPr>
+        <w:t>TABLE III</w:t>
+        <w:br/>
+        <w:t>GEOSPATIAL VALIDATION ACROSS INDIAN SUB-BASINS</w:t>
+      </w:r>
+    </w:p>
+    <w:tbl>
+      <w:tblPr>
+        <w:tblW w:type="auto" w:w="0"/>
+        <w:jc w:val="center"/>
+        <w:tblLayout w:type="fixed"/>
+        <w:tblLook w:firstColumn="1" w:firstRow="1" w:lastColumn="0" w:lastRow="0" w:noHBand="0" w:noVBand="1" w:val="04A0"/>
+      </w:tblPr>
+      <w:tblGrid>
+        <w:gridCol w:w="2610"/>
+        <w:gridCol w:w="2610"/>
+        <w:gridCol w:w="2610"/>
+        <w:gridCol w:w="2610"/>
+      </w:tblGrid>
       <w:tr>
         <w:tc>
           <w:tcPr>
-            <w:tcW w:type="dxa" w:w="1704"/>
-          </w:tcPr>
-          <w:p>
-            <w:r>
-              <w:rPr>
-                <w:sz w:val="16"/>
-              </w:rPr>
-              <w:t>Mass Conservation Residual</w:t>
-            </w:r>
-          </w:p>
-        </w:tc>
-        <w:tc>
-          <w:tcPr>
-            <w:tcW w:type="dxa" w:w="1704"/>
-          </w:tcPr>
-          <w:p>
-            <w:pPr>
-              <w:jc w:val="center"/>
-            </w:pPr>
-            <w:r>
-              <w:rPr>
-                <w:sz w:val="16"/>
-              </w:rPr>
-              <w:t>N/A</w:t>
-            </w:r>
-          </w:p>
-        </w:tc>
-        <w:tc>
-          <w:tcPr>
-            <w:tcW w:type="dxa" w:w="1704"/>
-          </w:tcPr>
-          <w:p>
-            <w:pPr>
-              <w:jc w:val="center"/>
-            </w:pPr>
-            <w:r>
-              <w:rPr>
-                <w:sz w:val="16"/>
-              </w:rPr>
-              <w:t>N/A</w:t>
-            </w:r>
-          </w:p>
-        </w:tc>
-        <w:tc>
-          <w:tcPr>
-            <w:tcW w:type="dxa" w:w="1704"/>
+            <w:tcW w:type="dxa" w:w="1584"/>
+            <w:shd w:fill="E2E8F0"/>
+            <w:tcMar>
+              <w:top w:w="30" w:type="dxa"/>
+              <w:bottom w:w="30" w:type="dxa"/>
+              <w:left w:w="30" w:type="dxa"/>
+              <w:right w:w="30" w:type="dxa"/>
+            </w:tcMar>
           </w:tcPr>
           <w:p>
             <w:pPr>
@@ -2222,94 +2879,22 @@
             <w:r>
               <w:rPr>
                 <w:b/>
-                <w:sz w:val="16"/>
+                <w:sz w:val="14"/>
               </w:rPr>
-              <w:t>&lt; 10⁻⁶ mm</w:t>
+              <w:t>District</w:t>
             </w:r>
           </w:p>
         </w:tc>
         <w:tc>
           <w:tcPr>
-            <w:tcW w:type="dxa" w:w="1704"/>
-          </w:tcPr>
-          <w:p>
-            <w:pPr>
-              <w:jc w:val="center"/>
-            </w:pPr>
-            <w:r>
-              <w:rPr>
-                <w:sz w:val="16"/>
-              </w:rPr>
-              <w:t>Invariant OK</w:t>
-            </w:r>
-          </w:p>
-        </w:tc>
-        <w:tc>
-          <w:tcPr>
-            <w:tcW w:type="dxa" w:w="1704"/>
-          </w:tcPr>
-          <w:p>
-            <w:pPr>
-              <w:jc w:val="center"/>
-            </w:pPr>
-            <w:r>
-              <w:rPr>
-                <w:sz w:val="16"/>
-              </w:rPr>
-              <w:t>Invariant OK</w:t>
-            </w:r>
-          </w:p>
-        </w:tc>
-      </w:tr>
-      <w:tr>
-        <w:tc>
-          <w:tcPr>
-            <w:tcW w:type="dxa" w:w="1704"/>
-          </w:tcPr>
-          <w:p>
-            <w:r>
-              <w:rPr>
-                <w:sz w:val="16"/>
-              </w:rPr>
-              <w:t>Inference Execution Latency</w:t>
-            </w:r>
-          </w:p>
-        </w:tc>
-        <w:tc>
-          <w:tcPr>
-            <w:tcW w:type="dxa" w:w="1704"/>
-          </w:tcPr>
-          <w:p>
-            <w:pPr>
-              <w:jc w:val="center"/>
-            </w:pPr>
-            <w:r>
-              <w:rPr>
-                <w:sz w:val="16"/>
-              </w:rPr>
-              <w:t>&lt; 1 ms</w:t>
-            </w:r>
-          </w:p>
-        </w:tc>
-        <w:tc>
-          <w:tcPr>
-            <w:tcW w:type="dxa" w:w="1704"/>
-          </w:tcPr>
-          <w:p>
-            <w:pPr>
-              <w:jc w:val="center"/>
-            </w:pPr>
-            <w:r>
-              <w:rPr>
-                <w:sz w:val="16"/>
-              </w:rPr>
-              <w:t>&lt; 1 ms</w:t>
-            </w:r>
-          </w:p>
-        </w:tc>
-        <w:tc>
-          <w:tcPr>
-            <w:tcW w:type="dxa" w:w="1704"/>
+            <w:tcW w:type="dxa" w:w="1296"/>
+            <w:shd w:fill="E2E8F0"/>
+            <w:tcMar>
+              <w:top w:w="30" w:type="dxa"/>
+              <w:bottom w:w="30" w:type="dxa"/>
+              <w:left w:w="30" w:type="dxa"/>
+              <w:right w:w="30" w:type="dxa"/>
+            </w:tcMar>
           </w:tcPr>
           <w:p>
             <w:pPr>
@@ -2318,99 +2903,22 @@
             <w:r>
               <w:rPr>
                 <w:b/>
-                <w:sz w:val="16"/>
+                <w:sz w:val="14"/>
               </w:rPr>
-              <w:t>18.2 ms</w:t>
+              <w:t>Soil Order</w:t>
             </w:r>
           </w:p>
         </w:tc>
         <w:tc>
           <w:tcPr>
-            <w:tcW w:type="dxa" w:w="1704"/>
-          </w:tcPr>
-          <w:p>
-            <w:pPr>
-              <w:jc w:val="center"/>
-            </w:pPr>
-            <w:r>
-              <w:rPr>
-                <w:sz w:val="16"/>
-              </w:rPr>
-              <w:t>Real-Time</w:t>
-            </w:r>
-          </w:p>
-        </w:tc>
-        <w:tc>
-          <w:tcPr>
-            <w:tcW w:type="dxa" w:w="1704"/>
-          </w:tcPr>
-          <w:p>
-            <w:pPr>
-              <w:jc w:val="center"/>
-            </w:pPr>
-            <w:r>
-              <w:rPr>
-                <w:sz w:val="16"/>
-              </w:rPr>
-              <w:t>Real-Time</w:t>
-            </w:r>
-          </w:p>
-        </w:tc>
-      </w:tr>
-    </w:tbl>
-    <w:p>
-      <w:pPr>
-        <w:spacing w:before="0" w:after="120" w:line="276" w:lineRule="auto"/>
-        <w:jc w:val="both"/>
-      </w:pPr>
-      <w:r>
-        <w:rPr>
-          <w:rFonts w:ascii="Times New Roman" w:hAnsi="Times New Roman"/>
-          <w:sz w:val="20"/>
-        </w:rPr>
-        <w:t>As demonstrated in Table II, HAFC achieves 49.72% water conservation relative to threshold control and 12.36% relative to classical PID feedback. The primary mechanisms driving this efficiency are:</w:t>
-        <w:br/>
-        <w:t>1) Elimination of Limit Cycles: Centroid defuzzification provides smooth valve modulation, eliminating drainage leaching caused by hysteresis switches.</w:t>
-        <w:br/>
-        <w:t>2) Precipitation Interlock: Layer 2 of the safety kernel immediately zeroes valve commands upon rain onset (P &gt; 5 mm), preventing the application of 1,840 L of wasted water observed in the baseline system.</w:t>
-        <w:br/>
-        <w:t>3) Supply-Constrained Scarcity Allocation: Under a severe drought scenario (22% reservoir storage), Stage 5 gracefully preserved 100% survival allocation to high-priority Zone 1 while throttling Zone 3, preventing uniform crop desiccation.</w:t>
-      </w:r>
-    </w:p>
-    <w:p>
-      <w:pPr>
-        <w:keepNext/>
-        <w:jc w:val="center"/>
-      </w:pPr>
-      <w:r>
-        <w:rPr>
-          <w:b/>
-          <w:sz w:val="17"/>
-        </w:rPr>
-        <w:t>TABLE III</w:t>
-        <w:br/>
-        <w:t>MULTI-DISTRICT GEOSPATIAL VALIDATION ACROSS INDIAN SUB-BASINS</w:t>
-      </w:r>
-    </w:p>
-    <w:tbl>
-      <w:tblPr>
-        <w:tblW w:type="auto" w:w="0"/>
-        <w:jc w:val="center"/>
-        <w:tblLook w:firstColumn="1" w:firstRow="1" w:lastColumn="0" w:lastRow="0" w:noHBand="0" w:noVBand="1" w:val="04A0"/>
-      </w:tblPr>
-      <w:tblGrid>
-        <w:gridCol w:w="1704"/>
-        <w:gridCol w:w="1704"/>
-        <w:gridCol w:w="1704"/>
-        <w:gridCol w:w="1704"/>
-        <w:gridCol w:w="1704"/>
-        <w:gridCol w:w="1704"/>
-      </w:tblGrid>
-      <w:tr>
-        <w:tc>
-          <w:tcPr>
-            <w:tcW w:type="dxa" w:w="1704"/>
+            <w:tcW w:type="dxa" w:w="1080"/>
             <w:shd w:fill="E2E8F0"/>
+            <w:tcMar>
+              <w:top w:w="30" w:type="dxa"/>
+              <w:bottom w:w="30" w:type="dxa"/>
+              <w:left w:w="30" w:type="dxa"/>
+              <w:right w:w="30" w:type="dxa"/>
+            </w:tcMar>
           </w:tcPr>
           <w:p>
             <w:pPr>
@@ -2419,16 +2927,22 @@
             <w:r>
               <w:rPr>
                 <w:b/>
-                <w:sz w:val="16"/>
+                <w:sz w:val="14"/>
               </w:rPr>
-              <w:t>District &amp; State</w:t>
+              <w:t>ET₀ (mm/d)</w:t>
             </w:r>
           </w:p>
         </w:tc>
         <w:tc>
           <w:tcPr>
-            <w:tcW w:type="dxa" w:w="1704"/>
+            <w:tcW w:type="dxa" w:w="1080"/>
             <w:shd w:fill="E2E8F0"/>
+            <w:tcMar>
+              <w:top w:w="30" w:type="dxa"/>
+              <w:bottom w:w="30" w:type="dxa"/>
+              <w:left w:w="30" w:type="dxa"/>
+              <w:right w:w="30" w:type="dxa"/>
+            </w:tcMar>
           </w:tcPr>
           <w:p>
             <w:pPr>
@@ -2437,16 +2951,61 @@
             <w:r>
               <w:rPr>
                 <w:b/>
-                <w:sz w:val="16"/>
+                <w:sz w:val="14"/>
               </w:rPr>
-              <w:t>Soil Taxonomy</w:t>
+              <w:t>Water Saved</w:t>
+            </w:r>
+          </w:p>
+        </w:tc>
+      </w:tr>
+      <w:tr>
+        <w:tc>
+          <w:tcPr>
+            <w:tcW w:type="dxa" w:w="1584"/>
+            <w:tcMar>
+              <w:top w:w="25" w:type="dxa"/>
+              <w:bottom w:w="25" w:type="dxa"/>
+              <w:left w:w="25" w:type="dxa"/>
+              <w:right w:w="25" w:type="dxa"/>
+            </w:tcMar>
+          </w:tcPr>
+          <w:p>
+            <w:r>
+              <w:rPr>
+                <w:sz w:val="14"/>
+              </w:rPr>
+              <w:t>Ludhiana, PB</w:t>
             </w:r>
           </w:p>
         </w:tc>
         <w:tc>
           <w:tcPr>
-            <w:tcW w:type="dxa" w:w="1704"/>
-            <w:shd w:fill="E2E8F0"/>
+            <w:tcW w:type="dxa" w:w="1296"/>
+            <w:tcMar>
+              <w:top w:w="25" w:type="dxa"/>
+              <w:bottom w:w="25" w:type="dxa"/>
+              <w:left w:w="25" w:type="dxa"/>
+              <w:right w:w="25" w:type="dxa"/>
+            </w:tcMar>
+          </w:tcPr>
+          <w:p>
+            <w:r>
+              <w:rPr>
+                <w:sz w:val="14"/>
+              </w:rPr>
+              <w:t>Inceptisol</w:t>
+            </w:r>
+          </w:p>
+        </w:tc>
+        <w:tc>
+          <w:tcPr>
+            <w:tcW w:type="dxa" w:w="1080"/>
+            <w:tcMar>
+              <w:top w:w="25" w:type="dxa"/>
+              <w:bottom w:w="25" w:type="dxa"/>
+              <w:left w:w="25" w:type="dxa"/>
+              <w:right w:w="25" w:type="dxa"/>
+            </w:tcMar>
           </w:tcPr>
           <w:p>
             <w:pPr>
@@ -2454,17 +3013,21 @@
             </w:pPr>
             <w:r>
               <w:rPr>
-                <w:b/>
-                <w:sz w:val="16"/>
+                <w:sz w:val="14"/>
               </w:rPr>
-              <w:t>ET₀ (mm/d)</w:t>
+              <w:t>4.82</w:t>
             </w:r>
           </w:p>
         </w:tc>
         <w:tc>
           <w:tcPr>
-            <w:tcW w:type="dxa" w:w="1704"/>
-            <w:shd w:fill="E2E8F0"/>
+            <w:tcW w:type="dxa" w:w="1080"/>
+            <w:tcMar>
+              <w:top w:w="25" w:type="dxa"/>
+              <w:bottom w:w="25" w:type="dxa"/>
+              <w:left w:w="25" w:type="dxa"/>
+              <w:right w:w="25" w:type="dxa"/>
+            </w:tcMar>
           </w:tcPr>
           <w:p>
             <w:pPr>
@@ -2472,136 +3035,7 @@
             </w:pPr>
             <w:r>
               <w:rPr>
-                <w:b/>
-                <w:sz w:val="16"/>
-              </w:rPr>
-              <w:t>Supervisory Command</w:t>
-            </w:r>
-          </w:p>
-        </w:tc>
-        <w:tc>
-          <w:tcPr>
-            <w:tcW w:type="dxa" w:w="1704"/>
-            <w:shd w:fill="E2E8F0"/>
-          </w:tcPr>
-          <w:p>
-            <w:pPr>
-              <w:jc w:val="center"/>
-            </w:pPr>
-            <w:r>
-              <w:rPr>
-                <w:b/>
-                <w:sz w:val="16"/>
-              </w:rPr>
-              <w:t>Allocated (L)</w:t>
-            </w:r>
-          </w:p>
-        </w:tc>
-        <w:tc>
-          <w:tcPr>
-            <w:tcW w:type="dxa" w:w="1704"/>
-            <w:shd w:fill="E2E8F0"/>
-          </w:tcPr>
-          <w:p>
-            <w:pPr>
-              <w:jc w:val="center"/>
-            </w:pPr>
-            <w:r>
-              <w:rPr>
-                <w:b/>
-                <w:sz w:val="16"/>
-              </w:rPr>
-              <w:t>Water Savings</w:t>
-            </w:r>
-          </w:p>
-        </w:tc>
-      </w:tr>
-      <w:tr>
-        <w:tc>
-          <w:tcPr>
-            <w:tcW w:type="dxa" w:w="1704"/>
-          </w:tcPr>
-          <w:p>
-            <w:r>
-              <w:rPr>
-                <w:sz w:val="16"/>
-              </w:rPr>
-              <w:t>Ludhiana, Punjab</w:t>
-            </w:r>
-          </w:p>
-        </w:tc>
-        <w:tc>
-          <w:tcPr>
-            <w:tcW w:type="dxa" w:w="1704"/>
-          </w:tcPr>
-          <w:p>
-            <w:r>
-              <w:rPr>
-                <w:sz w:val="16"/>
-              </w:rPr>
-              <w:t>Alluvial Loam (Inceptisol)</w:t>
-            </w:r>
-          </w:p>
-        </w:tc>
-        <w:tc>
-          <w:tcPr>
-            <w:tcW w:type="dxa" w:w="1704"/>
-          </w:tcPr>
-          <w:p>
-            <w:pPr>
-              <w:jc w:val="center"/>
-            </w:pPr>
-            <w:r>
-              <w:rPr>
-                <w:sz w:val="16"/>
-              </w:rPr>
-              <w:t>4.82 mm/d</w:t>
-            </w:r>
-          </w:p>
-        </w:tc>
-        <w:tc>
-          <w:tcPr>
-            <w:tcW w:type="dxa" w:w="1704"/>
-          </w:tcPr>
-          <w:p>
-            <w:pPr>
-              <w:jc w:val="center"/>
-            </w:pPr>
-            <w:r>
-              <w:rPr>
-                <w:sz w:val="16"/>
-              </w:rPr>
-              <w:t>62.0%</w:t>
-            </w:r>
-          </w:p>
-        </w:tc>
-        <w:tc>
-          <w:tcPr>
-            <w:tcW w:type="dxa" w:w="1704"/>
-          </w:tcPr>
-          <w:p>
-            <w:pPr>
-              <w:jc w:val="center"/>
-            </w:pPr>
-            <w:r>
-              <w:rPr>
-                <w:sz w:val="16"/>
-              </w:rPr>
-              <w:t>384.2 L</w:t>
-            </w:r>
-          </w:p>
-        </w:tc>
-        <w:tc>
-          <w:tcPr>
-            <w:tcW w:type="dxa" w:w="1704"/>
-          </w:tcPr>
-          <w:p>
-            <w:pPr>
-              <w:jc w:val="center"/>
-            </w:pPr>
-            <w:r>
-              <w:rPr>
-                <w:sz w:val="16"/>
+                <w:sz w:val="14"/>
               </w:rPr>
               <w:t>+49.7%</w:t>
             </w:r>
@@ -2611,33 +3045,51 @@
       <w:tr>
         <w:tc>
           <w:tcPr>
-            <w:tcW w:type="dxa" w:w="1704"/>
+            <w:tcW w:type="dxa" w:w="1584"/>
+            <w:tcMar>
+              <w:top w:w="25" w:type="dxa"/>
+              <w:bottom w:w="25" w:type="dxa"/>
+              <w:left w:w="25" w:type="dxa"/>
+              <w:right w:w="25" w:type="dxa"/>
+            </w:tcMar>
           </w:tcPr>
           <w:p>
             <w:r>
               <w:rPr>
-                <w:sz w:val="16"/>
+                <w:sz w:val="14"/>
               </w:rPr>
-              <w:t>Nashik, Maharashtra</w:t>
+              <w:t>Nashik, MH</w:t>
             </w:r>
           </w:p>
         </w:tc>
         <w:tc>
           <w:tcPr>
-            <w:tcW w:type="dxa" w:w="1704"/>
+            <w:tcW w:type="dxa" w:w="1296"/>
+            <w:tcMar>
+              <w:top w:w="25" w:type="dxa"/>
+              <w:bottom w:w="25" w:type="dxa"/>
+              <w:left w:w="25" w:type="dxa"/>
+              <w:right w:w="25" w:type="dxa"/>
+            </w:tcMar>
           </w:tcPr>
           <w:p>
             <w:r>
               <w:rPr>
-                <w:sz w:val="16"/>
+                <w:sz w:val="14"/>
               </w:rPr>
-              <w:t>Black Soil (Vertisol)</w:t>
+              <w:t>Vertisol</w:t>
             </w:r>
           </w:p>
         </w:tc>
         <w:tc>
           <w:tcPr>
-            <w:tcW w:type="dxa" w:w="1704"/>
+            <w:tcW w:type="dxa" w:w="1080"/>
+            <w:tcMar>
+              <w:top w:w="25" w:type="dxa"/>
+              <w:bottom w:w="25" w:type="dxa"/>
+              <w:left w:w="25" w:type="dxa"/>
+              <w:right w:w="25" w:type="dxa"/>
+            </w:tcMar>
           </w:tcPr>
           <w:p>
             <w:pPr>
@@ -2645,15 +3097,21 @@
             </w:pPr>
             <w:r>
               <w:rPr>
-                <w:sz w:val="16"/>
+                <w:sz w:val="14"/>
               </w:rPr>
-              <w:t>5.45 mm/d</w:t>
+              <w:t>5.45</w:t>
             </w:r>
           </w:p>
         </w:tc>
         <w:tc>
           <w:tcPr>
-            <w:tcW w:type="dxa" w:w="1704"/>
+            <w:tcW w:type="dxa" w:w="1080"/>
+            <w:tcMar>
+              <w:top w:w="25" w:type="dxa"/>
+              <w:bottom w:w="25" w:type="dxa"/>
+              <w:left w:w="25" w:type="dxa"/>
+              <w:right w:w="25" w:type="dxa"/>
+            </w:tcMar>
           </w:tcPr>
           <w:p>
             <w:pPr>
@@ -2661,39 +3119,7 @@
             </w:pPr>
             <w:r>
               <w:rPr>
-                <w:sz w:val="16"/>
-              </w:rPr>
-              <w:t>68.5%</w:t>
-            </w:r>
-          </w:p>
-        </w:tc>
-        <w:tc>
-          <w:tcPr>
-            <w:tcW w:type="dxa" w:w="1704"/>
-          </w:tcPr>
-          <w:p>
-            <w:pPr>
-              <w:jc w:val="center"/>
-            </w:pPr>
-            <w:r>
-              <w:rPr>
-                <w:sz w:val="16"/>
-              </w:rPr>
-              <w:t>412.0 L</w:t>
-            </w:r>
-          </w:p>
-        </w:tc>
-        <w:tc>
-          <w:tcPr>
-            <w:tcW w:type="dxa" w:w="1704"/>
-          </w:tcPr>
-          <w:p>
-            <w:pPr>
-              <w:jc w:val="center"/>
-            </w:pPr>
-            <w:r>
-              <w:rPr>
-                <w:sz w:val="16"/>
+                <w:sz w:val="14"/>
               </w:rPr>
               <w:t>+48.9%</w:t>
             </w:r>
@@ -2703,33 +3129,51 @@
       <w:tr>
         <w:tc>
           <w:tcPr>
-            <w:tcW w:type="dxa" w:w="1704"/>
+            <w:tcW w:type="dxa" w:w="1584"/>
+            <w:tcMar>
+              <w:top w:w="25" w:type="dxa"/>
+              <w:bottom w:w="25" w:type="dxa"/>
+              <w:left w:w="25" w:type="dxa"/>
+              <w:right w:w="25" w:type="dxa"/>
+            </w:tcMar>
           </w:tcPr>
           <w:p>
             <w:r>
               <w:rPr>
-                <w:sz w:val="16"/>
+                <w:sz w:val="14"/>
               </w:rPr>
-              <w:t>Rajkot, Gujarat</w:t>
+              <w:t>Rajkot, GJ</w:t>
             </w:r>
           </w:p>
         </w:tc>
         <w:tc>
           <w:tcPr>
-            <w:tcW w:type="dxa" w:w="1704"/>
+            <w:tcW w:type="dxa" w:w="1296"/>
+            <w:tcMar>
+              <w:top w:w="25" w:type="dxa"/>
+              <w:bottom w:w="25" w:type="dxa"/>
+              <w:left w:w="25" w:type="dxa"/>
+              <w:right w:w="25" w:type="dxa"/>
+            </w:tcMar>
           </w:tcPr>
           <w:p>
             <w:r>
               <w:rPr>
-                <w:sz w:val="16"/>
+                <w:sz w:val="14"/>
               </w:rPr>
-              <w:t>Medium Black Vertisol</w:t>
+              <w:t>Vertisol</w:t>
             </w:r>
           </w:p>
         </w:tc>
         <w:tc>
           <w:tcPr>
-            <w:tcW w:type="dxa" w:w="1704"/>
+            <w:tcW w:type="dxa" w:w="1080"/>
+            <w:tcMar>
+              <w:top w:w="25" w:type="dxa"/>
+              <w:bottom w:w="25" w:type="dxa"/>
+              <w:left w:w="25" w:type="dxa"/>
+              <w:right w:w="25" w:type="dxa"/>
+            </w:tcMar>
           </w:tcPr>
           <w:p>
             <w:pPr>
@@ -2737,15 +3181,21 @@
             </w:pPr>
             <w:r>
               <w:rPr>
-                <w:sz w:val="16"/>
+                <w:sz w:val="14"/>
               </w:rPr>
-              <w:t>6.20 mm/d</w:t>
+              <w:t>6.20</w:t>
             </w:r>
           </w:p>
         </w:tc>
         <w:tc>
           <w:tcPr>
-            <w:tcW w:type="dxa" w:w="1704"/>
+            <w:tcW w:type="dxa" w:w="1080"/>
+            <w:tcMar>
+              <w:top w:w="25" w:type="dxa"/>
+              <w:bottom w:w="25" w:type="dxa"/>
+              <w:left w:w="25" w:type="dxa"/>
+              <w:right w:w="25" w:type="dxa"/>
+            </w:tcMar>
           </w:tcPr>
           <w:p>
             <w:pPr>
@@ -2753,39 +3203,7 @@
             </w:pPr>
             <w:r>
               <w:rPr>
-                <w:sz w:val="16"/>
-              </w:rPr>
-              <w:t>74.0%</w:t>
-            </w:r>
-          </w:p>
-        </w:tc>
-        <w:tc>
-          <w:tcPr>
-            <w:tcW w:type="dxa" w:w="1704"/>
-          </w:tcPr>
-          <w:p>
-            <w:pPr>
-              <w:jc w:val="center"/>
-            </w:pPr>
-            <w:r>
-              <w:rPr>
-                <w:sz w:val="16"/>
-              </w:rPr>
-              <w:t>465.4 L</w:t>
-            </w:r>
-          </w:p>
-        </w:tc>
-        <w:tc>
-          <w:tcPr>
-            <w:tcW w:type="dxa" w:w="1704"/>
-          </w:tcPr>
-          <w:p>
-            <w:pPr>
-              <w:jc w:val="center"/>
-            </w:pPr>
-            <w:r>
-              <w:rPr>
-                <w:sz w:val="16"/>
+                <w:sz w:val="14"/>
               </w:rPr>
               <w:t>+51.2%</w:t>
             </w:r>
@@ -2795,33 +3213,51 @@
       <w:tr>
         <w:tc>
           <w:tcPr>
-            <w:tcW w:type="dxa" w:w="1704"/>
+            <w:tcW w:type="dxa" w:w="1584"/>
+            <w:tcMar>
+              <w:top w:w="25" w:type="dxa"/>
+              <w:bottom w:w="25" w:type="dxa"/>
+              <w:left w:w="25" w:type="dxa"/>
+              <w:right w:w="25" w:type="dxa"/>
+            </w:tcMar>
           </w:tcPr>
           <w:p>
             <w:r>
               <w:rPr>
-                <w:sz w:val="16"/>
+                <w:sz w:val="14"/>
               </w:rPr>
-              <w:t>Guntur, Andhra Pradesh</w:t>
+              <w:t>Guntur, AP</w:t>
             </w:r>
           </w:p>
         </w:tc>
         <w:tc>
           <w:tcPr>
-            <w:tcW w:type="dxa" w:w="1704"/>
+            <w:tcW w:type="dxa" w:w="1296"/>
+            <w:tcMar>
+              <w:top w:w="25" w:type="dxa"/>
+              <w:bottom w:w="25" w:type="dxa"/>
+              <w:left w:w="25" w:type="dxa"/>
+              <w:right w:w="25" w:type="dxa"/>
+            </w:tcMar>
           </w:tcPr>
           <w:p>
             <w:r>
               <w:rPr>
-                <w:sz w:val="16"/>
+                <w:sz w:val="14"/>
               </w:rPr>
-              <w:t>Coastal Clayey Vertisol</w:t>
+              <w:t>Vertisol</w:t>
             </w:r>
           </w:p>
         </w:tc>
         <w:tc>
           <w:tcPr>
-            <w:tcW w:type="dxa" w:w="1704"/>
+            <w:tcW w:type="dxa" w:w="1080"/>
+            <w:tcMar>
+              <w:top w:w="25" w:type="dxa"/>
+              <w:bottom w:w="25" w:type="dxa"/>
+              <w:left w:w="25" w:type="dxa"/>
+              <w:right w:w="25" w:type="dxa"/>
+            </w:tcMar>
           </w:tcPr>
           <w:p>
             <w:pPr>
@@ -2829,15 +3265,21 @@
             </w:pPr>
             <w:r>
               <w:rPr>
-                <w:sz w:val="16"/>
+                <w:sz w:val="14"/>
               </w:rPr>
-              <w:t>5.10 mm/d</w:t>
+              <w:t>5.10</w:t>
             </w:r>
           </w:p>
         </w:tc>
         <w:tc>
           <w:tcPr>
-            <w:tcW w:type="dxa" w:w="1704"/>
+            <w:tcW w:type="dxa" w:w="1080"/>
+            <w:tcMar>
+              <w:top w:w="25" w:type="dxa"/>
+              <w:bottom w:w="25" w:type="dxa"/>
+              <w:left w:w="25" w:type="dxa"/>
+              <w:right w:w="25" w:type="dxa"/>
+            </w:tcMar>
           </w:tcPr>
           <w:p>
             <w:pPr>
@@ -2845,39 +3287,7 @@
             </w:pPr>
             <w:r>
               <w:rPr>
-                <w:sz w:val="16"/>
-              </w:rPr>
-              <w:t>58.0%</w:t>
-            </w:r>
-          </w:p>
-        </w:tc>
-        <w:tc>
-          <w:tcPr>
-            <w:tcW w:type="dxa" w:w="1704"/>
-          </w:tcPr>
-          <w:p>
-            <w:pPr>
-              <w:jc w:val="center"/>
-            </w:pPr>
-            <w:r>
-              <w:rPr>
-                <w:sz w:val="16"/>
-              </w:rPr>
-              <w:t>360.8 L</w:t>
-            </w:r>
-          </w:p>
-        </w:tc>
-        <w:tc>
-          <w:tcPr>
-            <w:tcW w:type="dxa" w:w="1704"/>
-          </w:tcPr>
-          <w:p>
-            <w:pPr>
-              <w:jc w:val="center"/>
-            </w:pPr>
-            <w:r>
-              <w:rPr>
-                <w:sz w:val="16"/>
+                <w:sz w:val="14"/>
               </w:rPr>
               <w:t>+46.5%</w:t>
             </w:r>
@@ -2887,33 +3297,51 @@
       <w:tr>
         <w:tc>
           <w:tcPr>
-            <w:tcW w:type="dxa" w:w="1704"/>
+            <w:tcW w:type="dxa" w:w="1584"/>
+            <w:tcMar>
+              <w:top w:w="25" w:type="dxa"/>
+              <w:bottom w:w="25" w:type="dxa"/>
+              <w:left w:w="25" w:type="dxa"/>
+              <w:right w:w="25" w:type="dxa"/>
+            </w:tcMar>
           </w:tcPr>
           <w:p>
             <w:r>
               <w:rPr>
-                <w:sz w:val="16"/>
+                <w:sz w:val="14"/>
               </w:rPr>
-              <w:t>Jodhpur, Rajasthan</w:t>
+              <w:t>Jodhpur, RJ</w:t>
             </w:r>
           </w:p>
         </w:tc>
         <w:tc>
           <w:tcPr>
-            <w:tcW w:type="dxa" w:w="1704"/>
+            <w:tcW w:type="dxa" w:w="1296"/>
+            <w:tcMar>
+              <w:top w:w="25" w:type="dxa"/>
+              <w:bottom w:w="25" w:type="dxa"/>
+              <w:left w:w="25" w:type="dxa"/>
+              <w:right w:w="25" w:type="dxa"/>
+            </w:tcMar>
           </w:tcPr>
           <w:p>
             <w:r>
               <w:rPr>
-                <w:sz w:val="16"/>
+                <w:sz w:val="14"/>
               </w:rPr>
-              <w:t>Arid Desert Sand (Aridisol)</w:t>
+              <w:t>Aridisol</w:t>
             </w:r>
           </w:p>
         </w:tc>
         <w:tc>
           <w:tcPr>
-            <w:tcW w:type="dxa" w:w="1704"/>
+            <w:tcW w:type="dxa" w:w="1080"/>
+            <w:tcMar>
+              <w:top w:w="25" w:type="dxa"/>
+              <w:bottom w:w="25" w:type="dxa"/>
+              <w:left w:w="25" w:type="dxa"/>
+              <w:right w:w="25" w:type="dxa"/>
+            </w:tcMar>
           </w:tcPr>
           <w:p>
             <w:pPr>
@@ -2921,15 +3349,21 @@
             </w:pPr>
             <w:r>
               <w:rPr>
-                <w:sz w:val="16"/>
+                <w:sz w:val="14"/>
               </w:rPr>
-              <w:t>7.40 mm/d</w:t>
+              <w:t>7.40</w:t>
             </w:r>
           </w:p>
         </w:tc>
         <w:tc>
           <w:tcPr>
-            <w:tcW w:type="dxa" w:w="1704"/>
+            <w:tcW w:type="dxa" w:w="1080"/>
+            <w:tcMar>
+              <w:top w:w="25" w:type="dxa"/>
+              <w:bottom w:w="25" w:type="dxa"/>
+              <w:left w:w="25" w:type="dxa"/>
+              <w:right w:w="25" w:type="dxa"/>
+            </w:tcMar>
           </w:tcPr>
           <w:p>
             <w:pPr>
@@ -2937,39 +3371,7 @@
             </w:pPr>
             <w:r>
               <w:rPr>
-                <w:sz w:val="16"/>
-              </w:rPr>
-              <w:t>82.0%</w:t>
-            </w:r>
-          </w:p>
-        </w:tc>
-        <w:tc>
-          <w:tcPr>
-            <w:tcW w:type="dxa" w:w="1704"/>
-          </w:tcPr>
-          <w:p>
-            <w:pPr>
-              <w:jc w:val="center"/>
-            </w:pPr>
-            <w:r>
-              <w:rPr>
-                <w:sz w:val="16"/>
-              </w:rPr>
-              <w:t>518.2 L</w:t>
-            </w:r>
-          </w:p>
-        </w:tc>
-        <w:tc>
-          <w:tcPr>
-            <w:tcW w:type="dxa" w:w="1704"/>
-          </w:tcPr>
-          <w:p>
-            <w:pPr>
-              <w:jc w:val="center"/>
-            </w:pPr>
-            <w:r>
-              <w:rPr>
-                <w:sz w:val="16"/>
+                <w:sz w:val="14"/>
               </w:rPr>
               <w:t>+54.6%</w:t>
             </w:r>
@@ -2979,33 +3381,51 @@
       <w:tr>
         <w:tc>
           <w:tcPr>
-            <w:tcW w:type="dxa" w:w="1704"/>
+            <w:tcW w:type="dxa" w:w="1584"/>
+            <w:tcMar>
+              <w:top w:w="25" w:type="dxa"/>
+              <w:bottom w:w="25" w:type="dxa"/>
+              <w:left w:w="25" w:type="dxa"/>
+              <w:right w:w="25" w:type="dxa"/>
+            </w:tcMar>
           </w:tcPr>
           <w:p>
             <w:r>
               <w:rPr>
-                <w:sz w:val="16"/>
+                <w:sz w:val="14"/>
               </w:rPr>
-              <w:t>Mandya, Karnataka</w:t>
+              <w:t>Mandya, KA</w:t>
             </w:r>
           </w:p>
         </w:tc>
         <w:tc>
           <w:tcPr>
-            <w:tcW w:type="dxa" w:w="1704"/>
+            <w:tcW w:type="dxa" w:w="1296"/>
+            <w:tcMar>
+              <w:top w:w="25" w:type="dxa"/>
+              <w:bottom w:w="25" w:type="dxa"/>
+              <w:left w:w="25" w:type="dxa"/>
+              <w:right w:w="25" w:type="dxa"/>
+            </w:tcMar>
           </w:tcPr>
           <w:p>
             <w:r>
               <w:rPr>
-                <w:sz w:val="16"/>
+                <w:sz w:val="14"/>
               </w:rPr>
-              <w:t>Red Sandy Loam (Alfisol)</w:t>
+              <w:t>Alfisol</w:t>
             </w:r>
           </w:p>
         </w:tc>
         <w:tc>
           <w:tcPr>
-            <w:tcW w:type="dxa" w:w="1704"/>
+            <w:tcW w:type="dxa" w:w="1080"/>
+            <w:tcMar>
+              <w:top w:w="25" w:type="dxa"/>
+              <w:bottom w:w="25" w:type="dxa"/>
+              <w:left w:w="25" w:type="dxa"/>
+              <w:right w:w="25" w:type="dxa"/>
+            </w:tcMar>
           </w:tcPr>
           <w:p>
             <w:pPr>
@@ -3013,15 +3433,21 @@
             </w:pPr>
             <w:r>
               <w:rPr>
-                <w:sz w:val="16"/>
+                <w:sz w:val="14"/>
               </w:rPr>
-              <w:t>4.60 mm/d</w:t>
+              <w:t>4.60</w:t>
             </w:r>
           </w:p>
         </w:tc>
         <w:tc>
           <w:tcPr>
-            <w:tcW w:type="dxa" w:w="1704"/>
+            <w:tcW w:type="dxa" w:w="1080"/>
+            <w:tcMar>
+              <w:top w:w="25" w:type="dxa"/>
+              <w:bottom w:w="25" w:type="dxa"/>
+              <w:left w:w="25" w:type="dxa"/>
+              <w:right w:w="25" w:type="dxa"/>
+            </w:tcMar>
           </w:tcPr>
           <w:p>
             <w:pPr>
@@ -3029,39 +3455,7 @@
             </w:pPr>
             <w:r>
               <w:rPr>
-                <w:sz w:val="16"/>
-              </w:rPr>
-              <w:t>52.0%</w:t>
-            </w:r>
-          </w:p>
-        </w:tc>
-        <w:tc>
-          <w:tcPr>
-            <w:tcW w:type="dxa" w:w="1704"/>
-          </w:tcPr>
-          <w:p>
-            <w:pPr>
-              <w:jc w:val="center"/>
-            </w:pPr>
-            <w:r>
-              <w:rPr>
-                <w:sz w:val="16"/>
-              </w:rPr>
-              <w:t>325.0 L</w:t>
-            </w:r>
-          </w:p>
-        </w:tc>
-        <w:tc>
-          <w:tcPr>
-            <w:tcW w:type="dxa" w:w="1704"/>
-          </w:tcPr>
-          <w:p>
-            <w:pPr>
-              <w:jc w:val="center"/>
-            </w:pPr>
-            <w:r>
-              <w:rPr>
-                <w:sz w:val="16"/>
+                <w:sz w:val="14"/>
               </w:rPr>
               <w:t>+47.8%</w:t>
             </w:r>
@@ -3071,33 +3465,51 @@
       <w:tr>
         <w:tc>
           <w:tcPr>
-            <w:tcW w:type="dxa" w:w="1704"/>
+            <w:tcW w:type="dxa" w:w="1584"/>
+            <w:tcMar>
+              <w:top w:w="25" w:type="dxa"/>
+              <w:bottom w:w="25" w:type="dxa"/>
+              <w:left w:w="25" w:type="dxa"/>
+              <w:right w:w="25" w:type="dxa"/>
+            </w:tcMar>
           </w:tcPr>
           <w:p>
             <w:r>
               <w:rPr>
-                <w:sz w:val="16"/>
+                <w:sz w:val="14"/>
               </w:rPr>
-              <w:t>Jorhat, Assam</w:t>
+              <w:t>Jorhat, AS</w:t>
             </w:r>
           </w:p>
         </w:tc>
         <w:tc>
           <w:tcPr>
-            <w:tcW w:type="dxa" w:w="1704"/>
+            <w:tcW w:type="dxa" w:w="1296"/>
+            <w:tcMar>
+              <w:top w:w="25" w:type="dxa"/>
+              <w:bottom w:w="25" w:type="dxa"/>
+              <w:left w:w="25" w:type="dxa"/>
+              <w:right w:w="25" w:type="dxa"/>
+            </w:tcMar>
           </w:tcPr>
           <w:p>
             <w:r>
               <w:rPr>
-                <w:sz w:val="16"/>
+                <w:sz w:val="14"/>
               </w:rPr>
-              <w:t>Acidic Alluvial (Inceptisol)</w:t>
+              <w:t>Inceptisol</w:t>
             </w:r>
           </w:p>
         </w:tc>
         <w:tc>
           <w:tcPr>
-            <w:tcW w:type="dxa" w:w="1704"/>
+            <w:tcW w:type="dxa" w:w="1080"/>
+            <w:tcMar>
+              <w:top w:w="25" w:type="dxa"/>
+              <w:bottom w:w="25" w:type="dxa"/>
+              <w:left w:w="25" w:type="dxa"/>
+              <w:right w:w="25" w:type="dxa"/>
+            </w:tcMar>
           </w:tcPr>
           <w:p>
             <w:pPr>
@@ -3105,15 +3517,21 @@
             </w:pPr>
             <w:r>
               <w:rPr>
-                <w:sz w:val="16"/>
+                <w:sz w:val="14"/>
               </w:rPr>
-              <w:t>3.40 mm/d</w:t>
+              <w:t>3.40</w:t>
             </w:r>
           </w:p>
         </w:tc>
         <w:tc>
           <w:tcPr>
-            <w:tcW w:type="dxa" w:w="1704"/>
+            <w:tcW w:type="dxa" w:w="1080"/>
+            <w:tcMar>
+              <w:top w:w="25" w:type="dxa"/>
+              <w:bottom w:w="25" w:type="dxa"/>
+              <w:left w:w="25" w:type="dxa"/>
+              <w:right w:w="25" w:type="dxa"/>
+            </w:tcMar>
           </w:tcPr>
           <w:p>
             <w:pPr>
@@ -3121,39 +3539,7 @@
             </w:pPr>
             <w:r>
               <w:rPr>
-                <w:sz w:val="16"/>
-              </w:rPr>
-              <w:t>34.0%</w:t>
-            </w:r>
-          </w:p>
-        </w:tc>
-        <w:tc>
-          <w:tcPr>
-            <w:tcW w:type="dxa" w:w="1704"/>
-          </w:tcPr>
-          <w:p>
-            <w:pPr>
-              <w:jc w:val="center"/>
-            </w:pPr>
-            <w:r>
-              <w:rPr>
-                <w:sz w:val="16"/>
-              </w:rPr>
-              <w:t>210.5 L</w:t>
-            </w:r>
-          </w:p>
-        </w:tc>
-        <w:tc>
-          <w:tcPr>
-            <w:tcW w:type="dxa" w:w="1704"/>
-          </w:tcPr>
-          <w:p>
-            <w:pPr>
-              <w:jc w:val="center"/>
-            </w:pPr>
-            <w:r>
-              <w:rPr>
-                <w:sz w:val="16"/>
+                <w:sz w:val="14"/>
               </w:rPr>
               <w:t>+45.2%</w:t>
             </w:r>
@@ -3164,7 +3550,7 @@
     <w:p>
       <w:pPr>
         <w:keepNext/>
-        <w:spacing w:before="280" w:after="120"/>
+        <w:spacing w:before="200" w:after="80"/>
         <w:jc w:val="center"/>
       </w:pPr>
       <w:r>
@@ -3178,7 +3564,8 @@
     </w:p>
     <w:p>
       <w:pPr>
-        <w:spacing w:before="0" w:after="120" w:line="276" w:lineRule="auto"/>
+        <w:spacing w:before="0" w:after="80" w:line="252" w:lineRule="auto"/>
+        <w:ind w:firstLine="202"/>
         <w:jc w:val="both"/>
       </w:pPr>
       <w:r>
@@ -3187,20 +3574,68 @@
           <w:sz w:val="20"/>
         </w:rPr>
         <w:t>The system architecture was implemented using an enterprise full-stack deployment:</w:t>
-        <w:br/>
+      </w:r>
+    </w:p>
+    <w:p>
+      <w:pPr>
+        <w:spacing w:before="0" w:after="40" w:line="252" w:lineRule="auto"/>
+        <w:ind w:left="259" w:hanging="173"/>
+        <w:jc w:val="both"/>
+      </w:pPr>
+      <w:r>
+        <w:rPr>
+          <w:rFonts w:ascii="Times New Roman" w:hAnsi="Times New Roman"/>
+          <w:sz w:val="19"/>
+        </w:rPr>
         <w:t>• Backend Microservices: Implemented in Python 3.12 utilizing FastAPI and Uvicorn asynchronous workers. Data contracts are strictly enforced using Pydantic V2 schemas.</w:t>
-        <w:br/>
+      </w:r>
+    </w:p>
+    <w:p>
+      <w:pPr>
+        <w:spacing w:before="0" w:after="40" w:line="252" w:lineRule="auto"/>
+        <w:ind w:left="259" w:hanging="173"/>
+        <w:jc w:val="both"/>
+      </w:pPr>
+      <w:r>
+        <w:rPr>
+          <w:rFonts w:ascii="Times New Roman" w:hAnsi="Times New Roman"/>
+          <w:sz w:val="19"/>
+        </w:rPr>
         <w:t>• Fuzzy Runtime Engine: Custom vectorized NumPy implementations of Mamdani Min-Max composition, achieving end-to-end execution of all five stages in 18.2 ms.</w:t>
-        <w:br/>
+      </w:r>
+    </w:p>
+    <w:p>
+      <w:pPr>
+        <w:spacing w:before="0" w:after="40" w:line="252" w:lineRule="auto"/>
+        <w:ind w:left="259" w:hanging="173"/>
+        <w:jc w:val="both"/>
+      </w:pPr>
+      <w:r>
+        <w:rPr>
+          <w:rFonts w:ascii="Times New Roman" w:hAnsi="Times New Roman"/>
+          <w:sz w:val="19"/>
+        </w:rPr>
         <w:t>• Frontend Presentation: Built with Next.js 16.3 (Turbopack) and React 19, incorporating Leaflet vector layers and custom Web Audio haptic feedback.</w:t>
-        <w:br/>
+      </w:r>
+    </w:p>
+    <w:p>
+      <w:pPr>
+        <w:spacing w:before="0" w:after="40" w:line="252" w:lineRule="auto"/>
+        <w:ind w:left="259" w:hanging="173"/>
+        <w:jc w:val="both"/>
+      </w:pPr>
+      <w:r>
+        <w:rPr>
+          <w:rFonts w:ascii="Times New Roman" w:hAnsi="Times New Roman"/>
+          <w:sz w:val="19"/>
+        </w:rPr>
         <w:t>• AI Copilot Integration: Localized ICAR agronomy recommendations and risk advisories are generated through asynchronous calls to Groq Llama 3.3 70B grounded with live Tavily search queries.</w:t>
       </w:r>
     </w:p>
     <w:p>
       <w:pPr>
         <w:keepNext/>
-        <w:spacing w:before="280" w:after="120"/>
+        <w:spacing w:before="200" w:after="80"/>
         <w:jc w:val="center"/>
       </w:pPr>
       <w:r>
@@ -3214,7 +3649,8 @@
     </w:p>
     <w:p>
       <w:pPr>
-        <w:spacing w:before="0" w:after="120" w:line="276" w:lineRule="auto"/>
+        <w:spacing w:before="0" w:after="80" w:line="252" w:lineRule="auto"/>
+        <w:ind w:firstLine="202"/>
         <w:jc w:val="both"/>
       </w:pPr>
       <w:r>
@@ -3227,7 +3663,8 @@
     </w:p>
     <w:p>
       <w:pPr>
-        <w:spacing w:before="0" w:after="120" w:line="276" w:lineRule="auto"/>
+        <w:spacing w:before="0" w:after="80" w:line="252" w:lineRule="auto"/>
+        <w:ind w:firstLine="202"/>
         <w:jc w:val="both"/>
       </w:pPr>
       <w:r>
@@ -3236,18 +3673,54 @@
           <w:sz w:val="20"/>
         </w:rPr>
         <w:t>Future research directions include:</w:t>
-        <w:br/>
-        <w:t>1) Compiling the Python FIS kernels into C++ firmware for bare-metal edge execution on ultra-low-power STM32 and ESP32 microcontrollers over LoRaWAN networks.</w:t>
-        <w:br/>
-        <w:t>2) Integrating aerial drone multispectral indices (NDVI and NDWI) to adapt crop coefficients (K_c) dynamically at sub-field resolutions.</w:t>
-        <w:br/>
-        <w:t>3) Incorporating soil salinity and electrical conductivity (EC) sensors to enable optimal deficit leaching in saline river basins.</w:t>
+      </w:r>
+    </w:p>
+    <w:p>
+      <w:pPr>
+        <w:spacing w:before="0" w:after="40" w:line="252" w:lineRule="auto"/>
+        <w:ind w:left="259" w:hanging="173"/>
+        <w:jc w:val="both"/>
+      </w:pPr>
+      <w:r>
+        <w:rPr>
+          <w:rFonts w:ascii="Times New Roman" w:hAnsi="Times New Roman"/>
+          <w:sz w:val="19"/>
+        </w:rPr>
+        <w:t>• Compiling the Python FIS kernels into C++ firmware for bare-metal edge execution on ultra-low-power STM32 and ESP32 microcontrollers over LoRaWAN networks.</w:t>
+      </w:r>
+    </w:p>
+    <w:p>
+      <w:pPr>
+        <w:spacing w:before="0" w:after="40" w:line="252" w:lineRule="auto"/>
+        <w:ind w:left="259" w:hanging="173"/>
+        <w:jc w:val="both"/>
+      </w:pPr>
+      <w:r>
+        <w:rPr>
+          <w:rFonts w:ascii="Times New Roman" w:hAnsi="Times New Roman"/>
+          <w:sz w:val="19"/>
+        </w:rPr>
+        <w:t>• Integrating aerial drone multispectral indices (NDVI and NDWI) to adapt crop coefficients (K_c) dynamically at sub-field resolutions.</w:t>
+      </w:r>
+    </w:p>
+    <w:p>
+      <w:pPr>
+        <w:spacing w:before="0" w:after="40" w:line="252" w:lineRule="auto"/>
+        <w:ind w:left="259" w:hanging="173"/>
+        <w:jc w:val="both"/>
+      </w:pPr>
+      <w:r>
+        <w:rPr>
+          <w:rFonts w:ascii="Times New Roman" w:hAnsi="Times New Roman"/>
+          <w:sz w:val="19"/>
+        </w:rPr>
+        <w:t>• Incorporating soil salinity and electrical conductivity (EC) sensors to enable optimal deficit leaching in saline river basins.</w:t>
       </w:r>
     </w:p>
     <w:p>
       <w:pPr>
         <w:keepNext/>
-        <w:spacing w:before="280" w:after="120"/>
+        <w:spacing w:before="200" w:after="80"/>
         <w:jc w:val="center"/>
       </w:pPr>
       <w:r>
@@ -3261,7 +3734,8 @@
     </w:p>
     <w:p>
       <w:pPr>
-        <w:spacing w:before="0" w:after="120" w:line="276" w:lineRule="auto"/>
+        <w:spacing w:before="0" w:after="80" w:line="252" w:lineRule="auto"/>
+        <w:ind w:firstLine="202"/>
         <w:jc w:val="both"/>
       </w:pPr>
       <w:r>
@@ -3275,7 +3749,7 @@
     <w:p>
       <w:pPr>
         <w:keepNext/>
-        <w:spacing w:before="280" w:after="120"/>
+        <w:spacing w:before="200" w:after="80"/>
         <w:jc w:val="center"/>
       </w:pPr>
       <w:r>
@@ -3289,162 +3763,163 @@
     </w:p>
     <w:p>
       <w:pPr>
-        <w:spacing w:before="0" w:after="80"/>
-        <w:ind w:left="360" w:hanging="360"/>
+        <w:spacing w:before="0" w:after="50" w:line="245" w:lineRule="auto"/>
+        <w:ind w:left="259" w:hanging="259"/>
         <w:jc w:val="both"/>
       </w:pPr>
       <w:r>
         <w:rPr>
           <w:rFonts w:ascii="Times New Roman" w:hAnsi="Times New Roman"/>
-          <w:sz w:val="17"/>
+          <w:sz w:val="15"/>
         </w:rPr>
-        <w:t>[1] R. G. Allen, L. S. Pereira, D. Raes, and M. Smith, "Crop evapotranspiration - Guidelines for computing crop water requirements," FAO Irrigation and Drainage Paper 56, Food and Agriculture Organization of the United Nations, Rome, 1998.</w:t>
+        <w:t>[1] R. G. Allen, L. S. Pereira, D. Raes, and M. Smith, "Crop evapotranspiration - Guidelines for computing crop water requirements," FAO Irrigation and Drainage Paper 56, FAO, Rome, 1998.</w:t>
       </w:r>
     </w:p>
     <w:p>
       <w:pPr>
-        <w:spacing w:before="0" w:after="80"/>
-        <w:ind w:left="360" w:hanging="360"/>
+        <w:spacing w:before="0" w:after="50" w:line="245" w:lineRule="auto"/>
+        <w:ind w:left="259" w:hanging="259"/>
         <w:jc w:val="both"/>
       </w:pPr>
       <w:r>
         <w:rPr>
           <w:rFonts w:ascii="Times New Roman" w:hAnsi="Times New Roman"/>
-          <w:sz w:val="17"/>
+          <w:sz w:val="15"/>
         </w:rPr>
-        <w:t>[2] E. H. Mamdani and S. Assilian, "An experiment in linguistic synthesis with a fuzzy logic controller," International Journal of Man-Machine Studies, vol. 7, no. 1, pp. 1-13, 1975.</w:t>
+        <w:t>[2] E. H. Mamdani and S. Assilian, "An experiment in linguistic synthesis with a fuzzy logic controller," Int. J. Man-Mach. Stud., vol. 7, no. 1, pp. 1-13, 1975.</w:t>
       </w:r>
     </w:p>
     <w:p>
       <w:pPr>
-        <w:spacing w:before="0" w:after="80"/>
-        <w:ind w:left="360" w:hanging="360"/>
+        <w:spacing w:before="0" w:after="50" w:line="245" w:lineRule="auto"/>
+        <w:ind w:left="259" w:hanging="259"/>
         <w:jc w:val="both"/>
       </w:pPr>
       <w:r>
         <w:rPr>
           <w:rFonts w:ascii="Times New Roman" w:hAnsi="Times New Roman"/>
-          <w:sz w:val="17"/>
+          <w:sz w:val="15"/>
         </w:rPr>
-        <w:t>[3] L. A. Zadeh, "Fuzzy sets," Information and Control, vol. 8, no. 3, pp. 338-353, 1965.</w:t>
+        <w:t>[3] L. A. Zadeh, "Fuzzy sets," Inf. Control, vol. 8, no. 3, pp. 338-353, 1965.</w:t>
       </w:r>
     </w:p>
     <w:p>
       <w:pPr>
-        <w:spacing w:before="0" w:after="80"/>
-        <w:ind w:left="360" w:hanging="360"/>
+        <w:spacing w:before="0" w:after="50" w:line="245" w:lineRule="auto"/>
+        <w:ind w:left="259" w:hanging="259"/>
         <w:jc w:val="both"/>
       </w:pPr>
       <w:r>
         <w:rPr>
           <w:rFonts w:ascii="Times New Roman" w:hAnsi="Times New Roman"/>
-          <w:sz w:val="17"/>
+          <w:sz w:val="15"/>
         </w:rPr>
-        <w:t>[4] J. Zhang, Y. Guan, and F. Meng, "Intelligent multi-zone irrigation management based on wireless sensor networks and fuzzy neural systems," Computers and Electronics in Agriculture, vol. 187, p. 106288, 2021.</w:t>
+        <w:t>[4] J. Zhang, Y. Guan, and F. Meng, "Intelligent multi-zone irrigation management based on wireless sensor networks and fuzzy neural systems," Comput. Electron. Agric., vol. 187, p. 106288, 2021.</w:t>
       </w:r>
     </w:p>
     <w:p>
       <w:pPr>
-        <w:spacing w:before="0" w:after="80"/>
-        <w:ind w:left="360" w:hanging="360"/>
+        <w:spacing w:before="0" w:after="50" w:line="245" w:lineRule="auto"/>
+        <w:ind w:left="259" w:hanging="259"/>
         <w:jc w:val="both"/>
       </w:pPr>
       <w:r>
         <w:rPr>
           <w:rFonts w:ascii="Times New Roman" w:hAnsi="Times New Roman"/>
-          <w:sz w:val="17"/>
+          <w:sz w:val="15"/>
         </w:rPr>
-        <w:t>[5] A. Bwire, P. R. Weckler, and N. O. Maness, "Closed-loop precision irrigation using soil water tension and evapotranspiration models," IEEE Transactions on Agri-Food Electronics, vol. 1, no. 2, pp. 88-99, 2023.</w:t>
+        <w:t>[5] A. Bwire, P. R. Weckler, and N. O. Maness, "Closed-loop precision irrigation using soil water tension and evapotranspiration models," IEEE Trans. Agri-Food Electron., vol. 1, no. 2, pp. 88-99, 2023.</w:t>
       </w:r>
     </w:p>
     <w:p>
       <w:pPr>
-        <w:spacing w:before="0" w:after="80"/>
-        <w:ind w:left="360" w:hanging="360"/>
+        <w:spacing w:before="0" w:after="50" w:line="245" w:lineRule="auto"/>
+        <w:ind w:left="259" w:hanging="259"/>
         <w:jc w:val="both"/>
       </w:pPr>
       <w:r>
         <w:rPr>
           <w:rFonts w:ascii="Times New Roman" w:hAnsi="Times New Roman"/>
-          <w:sz w:val="17"/>
+          <w:sz w:val="15"/>
         </w:rPr>
-        <w:t>[6] S. Goodchild, K. S. Low, and M. P. Ward, "Cyber-physical systems for smart agriculture: Architecture, sensor networks, and control mechanisms," IEEE Systems Journal, vol. 16, no. 3, pp. 4120-4131, 2022.</w:t>
+        <w:t>[6] S. Goodchild, K. S. Low, and M. P. Ward, "Cyber-physical systems for smart agriculture: Architecture, sensor networks, and control mechanisms," IEEE Syst. J., vol. 16, no. 3, pp. 4120-4131, 2022.</w:t>
       </w:r>
     </w:p>
     <w:p>
       <w:pPr>
-        <w:spacing w:before="0" w:after="80"/>
-        <w:ind w:left="360" w:hanging="360"/>
+        <w:spacing w:before="0" w:after="50" w:line="245" w:lineRule="auto"/>
+        <w:ind w:left="259" w:hanging="259"/>
         <w:jc w:val="both"/>
       </w:pPr>
       <w:r>
         <w:rPr>
           <w:rFonts w:ascii="Times New Roman" w:hAnsi="Times New Roman"/>
-          <w:sz w:val="17"/>
+          <w:sz w:val="15"/>
         </w:rPr>
-        <w:t>[7] Indian Council of Agricultural Research (ICAR), Handbook of Agriculture: Facts and Figures for Farmers, Students and All Interested in Farming, 6th ed., Directorate of Information and Publications of Agriculture, New Delhi, 2011.</w:t>
+        <w:t>[7] Indian Council of Agricultural Research (ICAR), Handbook of Agriculture, 6th ed., ICAR, New Delhi, 2011.</w:t>
       </w:r>
     </w:p>
     <w:p>
       <w:pPr>
-        <w:spacing w:before="0" w:after="80"/>
-        <w:ind w:left="360" w:hanging="360"/>
+        <w:spacing w:before="0" w:after="50" w:line="245" w:lineRule="auto"/>
+        <w:ind w:left="259" w:hanging="259"/>
         <w:jc w:val="both"/>
       </w:pPr>
       <w:r>
         <w:rPr>
           <w:rFonts w:ascii="Times New Roman" w:hAnsi="Times New Roman"/>
-          <w:sz w:val="17"/>
+          <w:sz w:val="15"/>
         </w:rPr>
-        <w:t>[8] M. Smith, "CLIMWAT for CROPWAT: a database for irrigation planning and management," FAO Irrigation and Drainage Paper 49, FAO, Rome, 1993.</w:t>
+        <w:t>[8] M. Smith, "CLIMWAT for CROPWAT: a database for irrigation planning and management," FAO Irrigation Paper 49, Rome, 1993.</w:t>
       </w:r>
     </w:p>
     <w:p>
       <w:pPr>
-        <w:spacing w:before="0" w:after="80"/>
-        <w:ind w:left="360" w:hanging="360"/>
+        <w:spacing w:before="0" w:after="50" w:line="245" w:lineRule="auto"/>
+        <w:ind w:left="259" w:hanging="259"/>
         <w:jc w:val="both"/>
       </w:pPr>
       <w:r>
         <w:rPr>
           <w:rFonts w:ascii="Times New Roman" w:hAnsi="Times New Roman"/>
-          <w:sz w:val="17"/>
+          <w:sz w:val="15"/>
         </w:rPr>
-        <w:t>[9] Z. Popovic and M. J. Corvalan, "Water-filling algorithm under bounded peak and total power constraints: Applications to wireless resource allocation," IEEE Transactions on Signal Processing, vol. 68, pp. 2480-2493, 2020.</w:t>
+        <w:t>[9] Z. Popovic and M. J. Corvalan, "Water-filling algorithm under bounded peak and total power constraints," IEEE Trans. Signal Process., vol. 68, pp. 2480-2493, 2020.</w:t>
       </w:r>
     </w:p>
     <w:p>
       <w:pPr>
-        <w:spacing w:before="0" w:after="80"/>
-        <w:ind w:left="360" w:hanging="360"/>
+        <w:spacing w:before="0" w:after="50" w:line="245" w:lineRule="auto"/>
+        <w:ind w:left="259" w:hanging="259"/>
         <w:jc w:val="both"/>
       </w:pPr>
       <w:r>
         <w:rPr>
           <w:rFonts w:ascii="Times New Roman" w:hAnsi="Times New Roman"/>
-          <w:sz w:val="17"/>
+          <w:sz w:val="15"/>
         </w:rPr>
         <w:t>[10] G. F. Pardo, J. M. Blanes, and A. Garrigós, "Low-power IoT sensor node with LoRaWAN communication for precision drip irrigation," IEEE Access, vol. 10, pp. 45210-45222, 2022.</w:t>
       </w:r>
     </w:p>
     <w:p>
       <w:pPr>
-        <w:spacing w:before="0" w:after="80"/>
-        <w:ind w:left="360" w:hanging="360"/>
+        <w:spacing w:before="0" w:after="50" w:line="245" w:lineRule="auto"/>
+        <w:ind w:left="259" w:hanging="259"/>
         <w:jc w:val="both"/>
       </w:pPr>
       <w:r>
         <w:rPr>
           <w:rFonts w:ascii="Times New Roman" w:hAnsi="Times New Roman"/>
-          <w:sz w:val="17"/>
+          <w:sz w:val="15"/>
         </w:rPr>
-        <w:t>[11] Y. Erdem, L. Arin, T. Erdem, S. Polat, and M. Deveci, "Crop water stress index for assessing water status of drip irrigated tomato," Agricultural Water Management, vol. 98, no. 4, pp. 699-706, 2011.</w:t>
+        <w:t>[11] Y. Erdem, L. Arin, T. Erdem, S. Polat, and M. Deveci, "Crop water stress index for assessing water status of drip irrigated tomato," Agric. Water Manag., vol. 98, no. 4, pp. 699-706, 2011.</w:t>
       </w:r>
     </w:p>
     <w:sectPr>
+      <w:type w:val="continuous"/>
       <w:pgSz w:w="12240" w:h="15840"/>
-      <w:pgMar w:top="1080" w:right="1008" w:bottom="1440" w:left="1008" w:header="720" w:footer="720" w:gutter="0"/>
-      <w:cols w:space="720"/>
+      <w:pgMar w:top="1080" w:right="900" w:bottom="1440" w:left="900" w:header="720" w:footer="720" w:gutter="0"/>
+      <w:cols w:space="360" w:num="2"/>
       <w:docGrid w:linePitch="360"/>
     </w:sectPr>
   </w:body>

</xml_diff>